<commit_message>
Optimize figures for publication-style presentation
</commit_message>
<xml_diff>
--- a/report/final_report.docx
+++ b/report/final_report.docx
@@ -1049,7 +1049,7 @@
       <w:r>
         <w:drawing>
           <wp:inline xmlns:a="http://schemas.openxmlformats.org/drawingml/2006/main" xmlns:pic="http://schemas.openxmlformats.org/drawingml/2006/picture">
-            <wp:extent cx="5715000" cy="1603155"/>
+            <wp:extent cx="5715000" cy="1909944"/>
             <wp:docPr id="1" name="Picture 1"/>
             <wp:cNvGraphicFramePr>
               <a:graphicFrameLocks noChangeAspect="1"/>
@@ -1070,7 +1070,7 @@
                   <pic:spPr>
                     <a:xfrm>
                       <a:off x="0" y="0"/>
-                      <a:ext cx="5715000" cy="1603155"/>
+                      <a:ext cx="5715000" cy="1909944"/>
                     </a:xfrm>
                     <a:prstGeom prst="rect"/>
                   </pic:spPr>
@@ -3295,7 +3295,7 @@
       <w:r>
         <w:drawing>
           <wp:inline xmlns:a="http://schemas.openxmlformats.org/drawingml/2006/main" xmlns:pic="http://schemas.openxmlformats.org/drawingml/2006/picture">
-            <wp:extent cx="5715000" cy="1739811"/>
+            <wp:extent cx="5715000" cy="2145358"/>
             <wp:docPr id="2" name="Picture 2"/>
             <wp:cNvGraphicFramePr>
               <a:graphicFrameLocks noChangeAspect="1"/>
@@ -3316,7 +3316,7 @@
                   <pic:spPr>
                     <a:xfrm>
                       <a:off x="0" y="0"/>
-                      <a:ext cx="5715000" cy="1739811"/>
+                      <a:ext cx="5715000" cy="2145358"/>
                     </a:xfrm>
                     <a:prstGeom prst="rect"/>
                   </pic:spPr>
@@ -3909,7 +3909,7 @@
       <w:r>
         <w:drawing>
           <wp:inline xmlns:a="http://schemas.openxmlformats.org/drawingml/2006/main" xmlns:pic="http://schemas.openxmlformats.org/drawingml/2006/picture">
-            <wp:extent cx="5715000" cy="3611861"/>
+            <wp:extent cx="5715000" cy="3706203"/>
             <wp:docPr id="3" name="Picture 3"/>
             <wp:cNvGraphicFramePr>
               <a:graphicFrameLocks noChangeAspect="1"/>
@@ -3930,7 +3930,7 @@
                   <pic:spPr>
                     <a:xfrm>
                       <a:off x="0" y="0"/>
-                      <a:ext cx="5715000" cy="3611861"/>
+                      <a:ext cx="5715000" cy="3706203"/>
                     </a:xfrm>
                     <a:prstGeom prst="rect"/>
                   </pic:spPr>
@@ -4048,7 +4048,7 @@
       <w:r>
         <w:drawing>
           <wp:inline xmlns:a="http://schemas.openxmlformats.org/drawingml/2006/main" xmlns:pic="http://schemas.openxmlformats.org/drawingml/2006/picture">
-            <wp:extent cx="5715000" cy="2350777"/>
+            <wp:extent cx="5715000" cy="3033078"/>
             <wp:docPr id="4" name="Picture 4"/>
             <wp:cNvGraphicFramePr>
               <a:graphicFrameLocks noChangeAspect="1"/>
@@ -4069,7 +4069,7 @@
                   <pic:spPr>
                     <a:xfrm>
                       <a:off x="0" y="0"/>
-                      <a:ext cx="5715000" cy="2350777"/>
+                      <a:ext cx="5715000" cy="3033078"/>
                     </a:xfrm>
                     <a:prstGeom prst="rect"/>
                   </pic:spPr>
@@ -5116,7 +5116,7 @@
       <w:r>
         <w:drawing>
           <wp:inline xmlns:a="http://schemas.openxmlformats.org/drawingml/2006/main" xmlns:pic="http://schemas.openxmlformats.org/drawingml/2006/picture">
-            <wp:extent cx="5715000" cy="3630389"/>
+            <wp:extent cx="5715000" cy="3816266"/>
             <wp:docPr id="5" name="Picture 5"/>
             <wp:cNvGraphicFramePr>
               <a:graphicFrameLocks noChangeAspect="1"/>
@@ -5137,7 +5137,7 @@
                   <pic:spPr>
                     <a:xfrm>
                       <a:off x="0" y="0"/>
-                      <a:ext cx="5715000" cy="3630389"/>
+                      <a:ext cx="5715000" cy="3816266"/>
                     </a:xfrm>
                     <a:prstGeom prst="rect"/>
                   </pic:spPr>
@@ -5179,7 +5179,7 @@
       <w:r>
         <w:drawing>
           <wp:inline xmlns:a="http://schemas.openxmlformats.org/drawingml/2006/main" xmlns:pic="http://schemas.openxmlformats.org/drawingml/2006/picture">
-            <wp:extent cx="5715000" cy="3588702"/>
+            <wp:extent cx="5715000" cy="3470313"/>
             <wp:docPr id="6" name="Picture 6"/>
             <wp:cNvGraphicFramePr>
               <a:graphicFrameLocks noChangeAspect="1"/>
@@ -5200,7 +5200,7 @@
                   <pic:spPr>
                     <a:xfrm>
                       <a:off x="0" y="0"/>
-                      <a:ext cx="5715000" cy="3588702"/>
+                      <a:ext cx="5715000" cy="3470313"/>
                     </a:xfrm>
                     <a:prstGeom prst="rect"/>
                   </pic:spPr>
@@ -6045,7 +6045,7 @@
       <w:r>
         <w:drawing>
           <wp:inline xmlns:a="http://schemas.openxmlformats.org/drawingml/2006/main" xmlns:pic="http://schemas.openxmlformats.org/drawingml/2006/picture">
-            <wp:extent cx="5715000" cy="4257282"/>
+            <wp:extent cx="5715000" cy="4164118"/>
             <wp:docPr id="7" name="Picture 7"/>
             <wp:cNvGraphicFramePr>
               <a:graphicFrameLocks noChangeAspect="1"/>
@@ -6066,7 +6066,7 @@
                   <pic:spPr>
                     <a:xfrm>
                       <a:off x="0" y="0"/>
-                      <a:ext cx="5715000" cy="4257282"/>
+                      <a:ext cx="5715000" cy="4164118"/>
                     </a:xfrm>
                     <a:prstGeom prst="rect"/>
                   </pic:spPr>
@@ -6108,7 +6108,7 @@
       <w:r>
         <w:drawing>
           <wp:inline xmlns:a="http://schemas.openxmlformats.org/drawingml/2006/main" xmlns:pic="http://schemas.openxmlformats.org/drawingml/2006/picture">
-            <wp:extent cx="5715000" cy="3956783"/>
+            <wp:extent cx="5715000" cy="3906211"/>
             <wp:docPr id="8" name="Picture 8"/>
             <wp:cNvGraphicFramePr>
               <a:graphicFrameLocks noChangeAspect="1"/>
@@ -6129,7 +6129,7 @@
                   <pic:spPr>
                     <a:xfrm>
                       <a:off x="0" y="0"/>
-                      <a:ext cx="5715000" cy="3956783"/>
+                      <a:ext cx="5715000" cy="3906211"/>
                     </a:xfrm>
                     <a:prstGeom prst="rect"/>
                   </pic:spPr>

</xml_diff>

<commit_message>
Expand ECG monitoring scenarios
</commit_message>
<xml_diff>
--- a/report/final_report.docx
+++ b/report/final_report.docx
@@ -426,7 +426,7 @@
           <w:color w:val="183153"/>
           <w:sz w:val="21"/>
         </w:rPr>
-        <w:t>面向长时程可穿戴心电监护中的存储、传输与抗噪权衡，本项目构建了一个可复现的虚拟ECG采集系统，系统研究采样率与ADC有效位数对R峰检测的联合影响。实验使用MIT-BIH Arrhythmia Database的48条动态心电记录，以及MIT-BIH Noise Stress Test Database中12条标准电极运动伪影记录。虚拟采集链路包含0.5-40 Hz前端响应、抗混叠重采样、固定10 mV满量程量化和固定参数XQRS检测器。对5种采样率和6种有效位数组成的30种配置进行全因子评价，并使用灵敏度、阳性预测率、F1、R峰时间误差、削顶率和原始数据率进行综合比较。</w:t>
+        <w:t>面向长时程可穿戴心电监护中的存储、传输与抗噪权衡，本项目构建了一个可复现的虚拟ECG采集系统，系统研究采样率与ADC有效位数对R峰检测的联合影响，并进一步扩展到RR间期、瞬时心率和HRV技术可用性分析。实验使用MIT-BIH Arrhythmia Database的48条动态心电记录，以及MIT-BIH Noise Stress Test Database中12条标准电极运动伪影记录。虚拟采集链路包含0.5-40 Hz前端响应、抗混叠重采样、固定10 mV满量程量化和固定参数XQRS检测器。对5种采样率和6种有效位数组成的30种配置进行全因子评价，并使用灵敏度、阳性预测率、F1、R峰时间误差、RR误差、心率误差、HRV相对误差、削顶率和原始数据率进行综合比较。</w:t>
       </w:r>
     </w:p>
     <w:p>
@@ -441,7 +441,7 @@
           <w:color w:val="183153"/>
           <w:sz w:val="21"/>
         </w:rPr>
-        <w:t>结果表明，推荐配置为360 Hz / 6 bit。其干净条件合并F1为99.305%，参考配置360 Hz / 11 bit为99.391%，下降0.086个百分点；R峰时间误差中位数为0.00 ms。推荐配置将单通道原始数据率降至2160 bit/s，相对参考配置减少45.5%。在SNR不低于6 dB的标准运动伪影条件下，相对参考配置的最差F1下降为0.35个百分点。研究说明，在以R峰与RR间期监测为目标的条件下，可通过任务导向的采集参数联合设计显著降低数据量；但结论不能外推到ST段分析、临床诊断或真实硬件功耗。</w:t>
+        <w:t>结果表明，推荐配置为360 Hz / 6 bit。其干净条件合并F1为99.305%，参考配置360 Hz / 11 bit为99.391%，下降0.086个百分点；R峰时间误差中位数为0.00 ms，RR间期误差中位数为0.00 ms，瞬时心率误差中位数为0.000 bpm。推荐配置将单通道原始数据率降至2160 bit/s，相对参考配置减少45.5%。在SNR不低于6 dB的标准运动伪影条件下，相对参考配置的最差F1下降为0.35个百分点。研究说明，在以R峰、RR间期和心率趋势监测为目标的条件下，可通过任务导向的采集参数联合设计显著降低数据量；但HRV结果仅作为技术可用性分析，不能解释疾病风险，也不能外推到ST段分析、临床诊断或真实硬件功耗。</w:t>
       </w:r>
     </w:p>
     <w:p>
@@ -933,6 +933,169 @@
                 <w:sz w:val="17"/>
               </w:rPr>
               <w:t>时间误差中位数、P95时间误差</w:t>
+            </w:r>
+          </w:p>
+        </w:tc>
+      </w:tr>
+      <w:tr>
+        <w:tc>
+          <w:tcPr>
+            <w:tcW w:type="dxa" w:w="2376"/>
+            <w:vAlign w:val="center"/>
+            <w:tcMar>
+              <w:top w:w="90" w:type="dxa"/>
+              <w:start w:w="110" w:type="dxa"/>
+              <w:bottom w:w="90" w:type="dxa"/>
+              <w:end w:w="110" w:type="dxa"/>
+            </w:tcMar>
+            <w:shd w:fill="F4F8FC"/>
+          </w:tcPr>
+          <w:p>
+            <w:pPr>
+              <w:jc w:val="left"/>
+            </w:pPr>
+            <w:r>
+              <w:rPr>
+                <w:rFonts w:ascii="SimSun" w:hAnsi="SimSun" w:eastAsia="SimSun"/>
+                <w:b w:val="0"/>
+                <w:color w:val="183153"/>
+                <w:sz w:val="17"/>
+              </w:rPr>
+              <w:t>RR/心率趋势监护</w:t>
+            </w:r>
+          </w:p>
+        </w:tc>
+        <w:tc>
+          <w:tcPr>
+            <w:tcW w:type="dxa" w:w="3096"/>
+            <w:vAlign w:val="center"/>
+            <w:tcMar>
+              <w:top w:w="90" w:type="dxa"/>
+              <w:start w:w="110" w:type="dxa"/>
+              <w:bottom w:w="90" w:type="dxa"/>
+              <w:end w:w="110" w:type="dxa"/>
+            </w:tcMar>
+            <w:shd w:fill="F4F8FC"/>
+          </w:tcPr>
+          <w:p>
+            <w:pPr>
+              <w:jc w:val="center"/>
+            </w:pPr>
+            <w:r>
+              <w:rPr>
+                <w:rFonts w:ascii="SimSun" w:hAnsi="SimSun" w:eastAsia="SimSun"/>
+                <w:b w:val="0"/>
+                <w:color w:val="183153"/>
+                <w:sz w:val="17"/>
+              </w:rPr>
+              <w:t>连续R峰配对、检测漏检和误检</w:t>
+            </w:r>
+          </w:p>
+        </w:tc>
+        <w:tc>
+          <w:tcPr>
+            <w:tcW w:type="dxa" w:w="3672"/>
+            <w:vAlign w:val="center"/>
+            <w:tcMar>
+              <w:top w:w="90" w:type="dxa"/>
+              <w:start w:w="110" w:type="dxa"/>
+              <w:bottom w:w="90" w:type="dxa"/>
+              <w:end w:w="110" w:type="dxa"/>
+            </w:tcMar>
+            <w:shd w:fill="F4F8FC"/>
+          </w:tcPr>
+          <w:p>
+            <w:pPr>
+              <w:jc w:val="center"/>
+            </w:pPr>
+            <w:r>
+              <w:rPr>
+                <w:rFonts w:ascii="SimSun" w:hAnsi="SimSun" w:eastAsia="SimSun"/>
+                <w:b w:val="0"/>
+                <w:color w:val="183153"/>
+                <w:sz w:val="17"/>
+              </w:rPr>
+              <w:t>RR误差、瞬时心率误差、连续RR对比例</w:t>
+            </w:r>
+          </w:p>
+        </w:tc>
+      </w:tr>
+      <w:tr>
+        <w:tc>
+          <w:tcPr>
+            <w:tcW w:type="dxa" w:w="2376"/>
+            <w:vAlign w:val="center"/>
+            <w:tcMar>
+              <w:top w:w="90" w:type="dxa"/>
+              <w:start w:w="110" w:type="dxa"/>
+              <w:bottom w:w="90" w:type="dxa"/>
+              <w:end w:w="110" w:type="dxa"/>
+            </w:tcMar>
+          </w:tcPr>
+          <w:p>
+            <w:pPr>
+              <w:jc w:val="left"/>
+            </w:pPr>
+            <w:r>
+              <w:rPr>
+                <w:rFonts w:ascii="SimSun" w:hAnsi="SimSun" w:eastAsia="SimSun"/>
+                <w:b w:val="0"/>
+                <w:color w:val="183153"/>
+                <w:sz w:val="17"/>
+              </w:rPr>
+              <w:t>HRV技术可用性</w:t>
+            </w:r>
+          </w:p>
+        </w:tc>
+        <w:tc>
+          <w:tcPr>
+            <w:tcW w:type="dxa" w:w="3096"/>
+            <w:vAlign w:val="center"/>
+            <w:tcMar>
+              <w:top w:w="90" w:type="dxa"/>
+              <w:start w:w="110" w:type="dxa"/>
+              <w:bottom w:w="90" w:type="dxa"/>
+              <w:end w:w="110" w:type="dxa"/>
+            </w:tcMar>
+          </w:tcPr>
+          <w:p>
+            <w:pPr>
+              <w:jc w:val="center"/>
+            </w:pPr>
+            <w:r>
+              <w:rPr>
+                <w:rFonts w:ascii="SimSun" w:hAnsi="SimSun" w:eastAsia="SimSun"/>
+                <w:b w:val="0"/>
+                <w:color w:val="183153"/>
+                <w:sz w:val="17"/>
+              </w:rPr>
+              <w:t>RR序列完整性、短时变异性误差</w:t>
+            </w:r>
+          </w:p>
+        </w:tc>
+        <w:tc>
+          <w:tcPr>
+            <w:tcW w:type="dxa" w:w="3672"/>
+            <w:vAlign w:val="center"/>
+            <w:tcMar>
+              <w:top w:w="90" w:type="dxa"/>
+              <w:start w:w="110" w:type="dxa"/>
+              <w:bottom w:w="90" w:type="dxa"/>
+              <w:end w:w="110" w:type="dxa"/>
+            </w:tcMar>
+          </w:tcPr>
+          <w:p>
+            <w:pPr>
+              <w:jc w:val="center"/>
+            </w:pPr>
+            <w:r>
+              <w:rPr>
+                <w:rFonts w:ascii="SimSun" w:hAnsi="SimSun" w:eastAsia="SimSun"/>
+                <w:b w:val="0"/>
+                <w:color w:val="183153"/>
+                <w:sz w:val="17"/>
+              </w:rPr>
+              <w:t>SDNN相对误差、RMSSD相对误差、可用记录比例</w:t>
             </w:r>
           </w:p>
         </w:tc>
@@ -4026,6 +4189,29 @@
     </w:p>
     <w:p>
       <w:pPr>
+        <w:pStyle w:val="Heading2"/>
+      </w:pPr>
+      <w:r>
+        <w:t>3.4 监护指标扩展方法</w:t>
+      </w:r>
+    </w:p>
+    <w:p>
+      <w:pPr>
+        <w:spacing w:after="120" w:line="307" w:lineRule="auto"/>
+        <w:jc w:val="both"/>
+      </w:pPr>
+      <w:r>
+        <w:rPr>
+          <w:rFonts w:ascii="SimSun" w:hAnsi="SimSun" w:eastAsia="SimSun"/>
+          <w:b w:val="0"/>
+          <w:color w:val="183153"/>
+          <w:sz w:val="21"/>
+        </w:rPr>
+        <w:t>为避免医学场景只停留在“R峰检出率”，本项目对代表性配置进一步计算RR间期、瞬时心率和HRV技术可用性指标。首先在±150 ms窗口内对人工标注R峰与检测R峰进行一对一匹配；只有相邻两个参考R峰和对应的相邻两个检测R峰均连续匹配时，才计入有效RR对。RR间期误差定义为检测RR与参考RR的绝对差；瞬时心率误差定义为60/RR_detected - 60/RR_reference的绝对值。HRV指标采用常见的SDNN和RMSSD，但本项目只比较采集配置造成的相对误差，不解释自主神经功能、疾病风险或临床分层。</w:t>
+      </w:r>
+    </w:p>
+    <w:p>
+      <w:pPr>
         <w:pStyle w:val="Heading1"/>
       </w:pPr>
       <w:r>
@@ -6862,6 +7048,2483 @@
     </w:p>
     <w:p>
       <w:pPr>
+        <w:pStyle w:val="Heading2"/>
+      </w:pPr>
+      <w:r>
+        <w:t>4.4 医学监护指标扩展：RR、心率与HRV</w:t>
+      </w:r>
+    </w:p>
+    <w:p>
+      <w:pPr>
+        <w:spacing w:before="100" w:after="60"/>
+        <w:jc w:val="center"/>
+      </w:pPr>
+      <w:r>
+        <w:drawing>
+          <wp:inline xmlns:a="http://schemas.openxmlformats.org/drawingml/2006/main" xmlns:pic="http://schemas.openxmlformats.org/drawingml/2006/picture">
+            <wp:extent cx="5715000" cy="2342126"/>
+            <wp:docPr id="9" name="Picture 9"/>
+            <wp:cNvGraphicFramePr>
+              <a:graphicFrameLocks noChangeAspect="1"/>
+            </wp:cNvGraphicFramePr>
+            <a:graphic>
+              <a:graphicData uri="http://schemas.openxmlformats.org/drawingml/2006/picture">
+                <pic:pic>
+                  <pic:nvPicPr>
+                    <pic:cNvPr id="0" name="figure_09_monitoring_metrics.png"/>
+                    <pic:cNvPicPr/>
+                  </pic:nvPicPr>
+                  <pic:blipFill>
+                    <a:blip r:embed="rId19"/>
+                    <a:stretch>
+                      <a:fillRect/>
+                    </a:stretch>
+                  </pic:blipFill>
+                  <pic:spPr>
+                    <a:xfrm>
+                      <a:off x="0" y="0"/>
+                      <a:ext cx="5715000" cy="2342126"/>
+                    </a:xfrm>
+                    <a:prstGeom prst="rect"/>
+                  </pic:spPr>
+                </pic:pic>
+              </a:graphicData>
+            </a:graphic>
+          </wp:inline>
+        </w:drawing>
+      </w:r>
+    </w:p>
+    <w:p>
+      <w:pPr>
+        <w:spacing w:after="160"/>
+        <w:jc w:val="center"/>
+      </w:pPr>
+      <w:r>
+        <w:rPr>
+          <w:rFonts w:ascii="SimSun" w:hAnsi="SimSun" w:eastAsia="SimSun"/>
+          <w:b w:val="0"/>
+          <w:color w:val="657786"/>
+          <w:sz w:val="18"/>
+        </w:rPr>
+        <w:t>图9　代表配置下RR、心率与HRV监护指标。</w:t>
+      </w:r>
+    </w:p>
+    <w:p>
+      <w:pPr>
+        <w:spacing w:after="120" w:line="307" w:lineRule="auto"/>
+        <w:jc w:val="both"/>
+      </w:pPr>
+      <w:r>
+        <w:rPr>
+          <w:rFonts w:ascii="SimSun" w:hAnsi="SimSun" w:eastAsia="SimSun"/>
+          <w:b w:val="0"/>
+          <w:color w:val="183153"/>
+          <w:sz w:val="21"/>
+        </w:rPr>
+        <w:t>图9和表9显示，推荐配置360 Hz / 6 bit在R峰检出性能之外，也保持了较稳定的RR间期和瞬时心率趋势：RR误差中位数为0.00 ms，心率误差中位数为0.000 bpm，连续有效RR对比例为99.73%。SDNN和RMSSD相对误差分别为0.32%和0.82%，HRV可用记录比例为60.4%。这些指标说明推荐配置适合R峰、RR和心率趋势监护；若用于HRV趋势观察，需要同时检查RR连续性和SDNN/RMSSD误差，不应将HRV结果解释为临床诊断结论。</w:t>
+      </w:r>
+    </w:p>
+    <w:p>
+      <w:pPr>
+        <w:spacing w:after="120" w:line="307" w:lineRule="auto"/>
+        <w:jc w:val="both"/>
+      </w:pPr>
+      <w:r>
+        <w:rPr>
+          <w:rFonts w:ascii="SimSun" w:hAnsi="SimSun" w:eastAsia="SimSun"/>
+          <w:b w:val="0"/>
+          <w:color w:val="183153"/>
+          <w:sz w:val="21"/>
+        </w:rPr>
+        <w:t>表9　代表性配置的RR、心率与HRV技术指标</w:t>
+      </w:r>
+    </w:p>
+    <w:tbl>
+      <w:tblPr>
+        <w:tblStyle w:val="TableGrid"/>
+        <w:tblW w:type="auto" w:w="0"/>
+        <w:jc w:val="center"/>
+        <w:tblLayout w:type="fixed"/>
+        <w:tblLook w:firstColumn="1" w:firstRow="1" w:lastColumn="0" w:lastRow="0" w:noHBand="0" w:noVBand="1" w:val="04A0"/>
+      </w:tblPr>
+      <w:tblGrid>
+        <w:gridCol w:w="1378"/>
+        <w:gridCol w:w="1378"/>
+        <w:gridCol w:w="1378"/>
+        <w:gridCol w:w="1378"/>
+        <w:gridCol w:w="1378"/>
+        <w:gridCol w:w="1378"/>
+        <w:gridCol w:w="1378"/>
+      </w:tblGrid>
+      <w:tr>
+        <w:trPr>
+          <w:tblHeader w:val="true"/>
+        </w:trPr>
+        <w:tc>
+          <w:tcPr>
+            <w:tcW w:type="dxa" w:w="1296"/>
+            <w:vAlign w:val="center"/>
+            <w:shd w:fill="276FBF"/>
+            <w:tcMar>
+              <w:top w:w="90" w:type="dxa"/>
+              <w:start w:w="110" w:type="dxa"/>
+              <w:bottom w:w="90" w:type="dxa"/>
+              <w:end w:w="110" w:type="dxa"/>
+            </w:tcMar>
+          </w:tcPr>
+          <w:p>
+            <w:pPr>
+              <w:jc w:val="center"/>
+            </w:pPr>
+            <w:r>
+              <w:rPr>
+                <w:rFonts w:ascii="Microsoft YaHei" w:hAnsi="Microsoft YaHei" w:eastAsia="Microsoft YaHei"/>
+                <w:b/>
+                <w:color w:val="FFFFFF"/>
+                <w:sz w:val="18"/>
+              </w:rPr>
+              <w:t>配置</w:t>
+            </w:r>
+          </w:p>
+        </w:tc>
+        <w:tc>
+          <w:tcPr>
+            <w:tcW w:type="dxa" w:w="1296"/>
+            <w:vAlign w:val="center"/>
+            <w:shd w:fill="276FBF"/>
+            <w:tcMar>
+              <w:top w:w="90" w:type="dxa"/>
+              <w:start w:w="110" w:type="dxa"/>
+              <w:bottom w:w="90" w:type="dxa"/>
+              <w:end w:w="110" w:type="dxa"/>
+            </w:tcMar>
+          </w:tcPr>
+          <w:p>
+            <w:pPr>
+              <w:jc w:val="center"/>
+            </w:pPr>
+            <w:r>
+              <w:rPr>
+                <w:rFonts w:ascii="Microsoft YaHei" w:hAnsi="Microsoft YaHei" w:eastAsia="Microsoft YaHei"/>
+                <w:b/>
+                <w:color w:val="FFFFFF"/>
+                <w:sz w:val="18"/>
+              </w:rPr>
+              <w:t>RR误差中位数 (ms)</w:t>
+            </w:r>
+          </w:p>
+        </w:tc>
+        <w:tc>
+          <w:tcPr>
+            <w:tcW w:type="dxa" w:w="1296"/>
+            <w:vAlign w:val="center"/>
+            <w:shd w:fill="276FBF"/>
+            <w:tcMar>
+              <w:top w:w="90" w:type="dxa"/>
+              <w:start w:w="110" w:type="dxa"/>
+              <w:bottom w:w="90" w:type="dxa"/>
+              <w:end w:w="110" w:type="dxa"/>
+            </w:tcMar>
+          </w:tcPr>
+          <w:p>
+            <w:pPr>
+              <w:jc w:val="center"/>
+            </w:pPr>
+            <w:r>
+              <w:rPr>
+                <w:rFonts w:ascii="Microsoft YaHei" w:hAnsi="Microsoft YaHei" w:eastAsia="Microsoft YaHei"/>
+                <w:b/>
+                <w:color w:val="FFFFFF"/>
+                <w:sz w:val="18"/>
+              </w:rPr>
+              <w:t>心率误差中位数 (bpm)</w:t>
+            </w:r>
+          </w:p>
+        </w:tc>
+        <w:tc>
+          <w:tcPr>
+            <w:tcW w:type="dxa" w:w="1296"/>
+            <w:vAlign w:val="center"/>
+            <w:shd w:fill="276FBF"/>
+            <w:tcMar>
+              <w:top w:w="90" w:type="dxa"/>
+              <w:start w:w="110" w:type="dxa"/>
+              <w:bottom w:w="90" w:type="dxa"/>
+              <w:end w:w="110" w:type="dxa"/>
+            </w:tcMar>
+          </w:tcPr>
+          <w:p>
+            <w:pPr>
+              <w:jc w:val="center"/>
+            </w:pPr>
+            <w:r>
+              <w:rPr>
+                <w:rFonts w:ascii="Microsoft YaHei" w:hAnsi="Microsoft YaHei" w:eastAsia="Microsoft YaHei"/>
+                <w:b/>
+                <w:color w:val="FFFFFF"/>
+                <w:sz w:val="18"/>
+              </w:rPr>
+              <w:t>连续RR对比例 (%)</w:t>
+            </w:r>
+          </w:p>
+        </w:tc>
+        <w:tc>
+          <w:tcPr>
+            <w:tcW w:type="dxa" w:w="1296"/>
+            <w:vAlign w:val="center"/>
+            <w:shd w:fill="276FBF"/>
+            <w:tcMar>
+              <w:top w:w="90" w:type="dxa"/>
+              <w:start w:w="110" w:type="dxa"/>
+              <w:bottom w:w="90" w:type="dxa"/>
+              <w:end w:w="110" w:type="dxa"/>
+            </w:tcMar>
+          </w:tcPr>
+          <w:p>
+            <w:pPr>
+              <w:jc w:val="center"/>
+            </w:pPr>
+            <w:r>
+              <w:rPr>
+                <w:rFonts w:ascii="Microsoft YaHei" w:hAnsi="Microsoft YaHei" w:eastAsia="Microsoft YaHei"/>
+                <w:b/>
+                <w:color w:val="FFFFFF"/>
+                <w:sz w:val="18"/>
+              </w:rPr>
+              <w:t>SDNN相对误差 (%)</w:t>
+            </w:r>
+          </w:p>
+        </w:tc>
+        <w:tc>
+          <w:tcPr>
+            <w:tcW w:type="dxa" w:w="1296"/>
+            <w:vAlign w:val="center"/>
+            <w:shd w:fill="276FBF"/>
+            <w:tcMar>
+              <w:top w:w="90" w:type="dxa"/>
+              <w:start w:w="110" w:type="dxa"/>
+              <w:bottom w:w="90" w:type="dxa"/>
+              <w:end w:w="110" w:type="dxa"/>
+            </w:tcMar>
+          </w:tcPr>
+          <w:p>
+            <w:pPr>
+              <w:jc w:val="center"/>
+            </w:pPr>
+            <w:r>
+              <w:rPr>
+                <w:rFonts w:ascii="Microsoft YaHei" w:hAnsi="Microsoft YaHei" w:eastAsia="Microsoft YaHei"/>
+                <w:b/>
+                <w:color w:val="FFFFFF"/>
+                <w:sz w:val="18"/>
+              </w:rPr>
+              <w:t>RMSSD相对误差 (%)</w:t>
+            </w:r>
+          </w:p>
+        </w:tc>
+        <w:tc>
+          <w:tcPr>
+            <w:tcW w:type="dxa" w:w="1296"/>
+            <w:vAlign w:val="center"/>
+            <w:shd w:fill="276FBF"/>
+            <w:tcMar>
+              <w:top w:w="90" w:type="dxa"/>
+              <w:start w:w="110" w:type="dxa"/>
+              <w:bottom w:w="90" w:type="dxa"/>
+              <w:end w:w="110" w:type="dxa"/>
+            </w:tcMar>
+          </w:tcPr>
+          <w:p>
+            <w:pPr>
+              <w:jc w:val="center"/>
+            </w:pPr>
+            <w:r>
+              <w:rPr>
+                <w:rFonts w:ascii="Microsoft YaHei" w:hAnsi="Microsoft YaHei" w:eastAsia="Microsoft YaHei"/>
+                <w:b/>
+                <w:color w:val="FFFFFF"/>
+                <w:sz w:val="18"/>
+              </w:rPr>
+              <w:t>HRV可用记录比例</w:t>
+            </w:r>
+          </w:p>
+        </w:tc>
+      </w:tr>
+      <w:tr>
+        <w:tc>
+          <w:tcPr>
+            <w:tcW w:type="dxa" w:w="1296"/>
+            <w:vAlign w:val="center"/>
+            <w:tcMar>
+              <w:top w:w="90" w:type="dxa"/>
+              <w:start w:w="110" w:type="dxa"/>
+              <w:bottom w:w="90" w:type="dxa"/>
+              <w:end w:w="110" w:type="dxa"/>
+            </w:tcMar>
+            <w:shd w:fill="F4F8FC"/>
+          </w:tcPr>
+          <w:p>
+            <w:pPr>
+              <w:jc w:val="left"/>
+            </w:pPr>
+            <w:r>
+              <w:rPr>
+                <w:rFonts w:ascii="SimSun" w:hAnsi="SimSun" w:eastAsia="SimSun"/>
+                <w:b w:val="0"/>
+                <w:color w:val="183153"/>
+                <w:sz w:val="17"/>
+              </w:rPr>
+              <w:t>360 Hz / 11 bit</w:t>
+            </w:r>
+          </w:p>
+        </w:tc>
+        <w:tc>
+          <w:tcPr>
+            <w:tcW w:type="dxa" w:w="1296"/>
+            <w:vAlign w:val="center"/>
+            <w:tcMar>
+              <w:top w:w="90" w:type="dxa"/>
+              <w:start w:w="110" w:type="dxa"/>
+              <w:bottom w:w="90" w:type="dxa"/>
+              <w:end w:w="110" w:type="dxa"/>
+            </w:tcMar>
+            <w:shd w:fill="F4F8FC"/>
+          </w:tcPr>
+          <w:p>
+            <w:pPr>
+              <w:jc w:val="center"/>
+            </w:pPr>
+            <w:r>
+              <w:rPr>
+                <w:rFonts w:ascii="SimSun" w:hAnsi="SimSun" w:eastAsia="SimSun"/>
+                <w:b w:val="0"/>
+                <w:color w:val="183153"/>
+                <w:sz w:val="17"/>
+              </w:rPr>
+              <w:t>0.00</w:t>
+            </w:r>
+          </w:p>
+        </w:tc>
+        <w:tc>
+          <w:tcPr>
+            <w:tcW w:type="dxa" w:w="1296"/>
+            <w:vAlign w:val="center"/>
+            <w:tcMar>
+              <w:top w:w="90" w:type="dxa"/>
+              <w:start w:w="110" w:type="dxa"/>
+              <w:bottom w:w="90" w:type="dxa"/>
+              <w:end w:w="110" w:type="dxa"/>
+            </w:tcMar>
+            <w:shd w:fill="F4F8FC"/>
+          </w:tcPr>
+          <w:p>
+            <w:pPr>
+              <w:jc w:val="center"/>
+            </w:pPr>
+            <w:r>
+              <w:rPr>
+                <w:rFonts w:ascii="SimSun" w:hAnsi="SimSun" w:eastAsia="SimSun"/>
+                <w:b w:val="0"/>
+                <w:color w:val="183153"/>
+                <w:sz w:val="17"/>
+              </w:rPr>
+              <w:t>0.000</w:t>
+            </w:r>
+          </w:p>
+        </w:tc>
+        <w:tc>
+          <w:tcPr>
+            <w:tcW w:type="dxa" w:w="1296"/>
+            <w:vAlign w:val="center"/>
+            <w:tcMar>
+              <w:top w:w="90" w:type="dxa"/>
+              <w:start w:w="110" w:type="dxa"/>
+              <w:bottom w:w="90" w:type="dxa"/>
+              <w:end w:w="110" w:type="dxa"/>
+            </w:tcMar>
+            <w:shd w:fill="F4F8FC"/>
+          </w:tcPr>
+          <w:p>
+            <w:pPr>
+              <w:jc w:val="center"/>
+            </w:pPr>
+            <w:r>
+              <w:rPr>
+                <w:rFonts w:ascii="SimSun" w:hAnsi="SimSun" w:eastAsia="SimSun"/>
+                <w:b w:val="0"/>
+                <w:color w:val="183153"/>
+                <w:sz w:val="17"/>
+              </w:rPr>
+              <w:t>99.73</w:t>
+            </w:r>
+          </w:p>
+        </w:tc>
+        <w:tc>
+          <w:tcPr>
+            <w:tcW w:type="dxa" w:w="1296"/>
+            <w:vAlign w:val="center"/>
+            <w:tcMar>
+              <w:top w:w="90" w:type="dxa"/>
+              <w:start w:w="110" w:type="dxa"/>
+              <w:bottom w:w="90" w:type="dxa"/>
+              <w:end w:w="110" w:type="dxa"/>
+            </w:tcMar>
+            <w:shd w:fill="F4F8FC"/>
+          </w:tcPr>
+          <w:p>
+            <w:pPr>
+              <w:jc w:val="center"/>
+            </w:pPr>
+            <w:r>
+              <w:rPr>
+                <w:rFonts w:ascii="SimSun" w:hAnsi="SimSun" w:eastAsia="SimSun"/>
+                <w:b w:val="0"/>
+                <w:color w:val="183153"/>
+                <w:sz w:val="17"/>
+              </w:rPr>
+              <w:t>0.30</w:t>
+            </w:r>
+          </w:p>
+        </w:tc>
+        <w:tc>
+          <w:tcPr>
+            <w:tcW w:type="dxa" w:w="1296"/>
+            <w:vAlign w:val="center"/>
+            <w:tcMar>
+              <w:top w:w="90" w:type="dxa"/>
+              <w:start w:w="110" w:type="dxa"/>
+              <w:bottom w:w="90" w:type="dxa"/>
+              <w:end w:w="110" w:type="dxa"/>
+            </w:tcMar>
+            <w:shd w:fill="F4F8FC"/>
+          </w:tcPr>
+          <w:p>
+            <w:pPr>
+              <w:jc w:val="center"/>
+            </w:pPr>
+            <w:r>
+              <w:rPr>
+                <w:rFonts w:ascii="SimSun" w:hAnsi="SimSun" w:eastAsia="SimSun"/>
+                <w:b w:val="0"/>
+                <w:color w:val="183153"/>
+                <w:sz w:val="17"/>
+              </w:rPr>
+              <w:t>0.61</w:t>
+            </w:r>
+          </w:p>
+        </w:tc>
+        <w:tc>
+          <w:tcPr>
+            <w:tcW w:type="dxa" w:w="1296"/>
+            <w:vAlign w:val="center"/>
+            <w:tcMar>
+              <w:top w:w="90" w:type="dxa"/>
+              <w:start w:w="110" w:type="dxa"/>
+              <w:bottom w:w="90" w:type="dxa"/>
+              <w:end w:w="110" w:type="dxa"/>
+            </w:tcMar>
+            <w:shd w:fill="F4F8FC"/>
+          </w:tcPr>
+          <w:p>
+            <w:pPr>
+              <w:jc w:val="center"/>
+            </w:pPr>
+            <w:r>
+              <w:rPr>
+                <w:rFonts w:ascii="SimSun" w:hAnsi="SimSun" w:eastAsia="SimSun"/>
+                <w:b w:val="0"/>
+                <w:color w:val="183153"/>
+                <w:sz w:val="17"/>
+              </w:rPr>
+              <w:t>64.6%</w:t>
+            </w:r>
+          </w:p>
+        </w:tc>
+      </w:tr>
+      <w:tr>
+        <w:tc>
+          <w:tcPr>
+            <w:tcW w:type="dxa" w:w="1296"/>
+            <w:vAlign w:val="center"/>
+            <w:tcMar>
+              <w:top w:w="90" w:type="dxa"/>
+              <w:start w:w="110" w:type="dxa"/>
+              <w:bottom w:w="90" w:type="dxa"/>
+              <w:end w:w="110" w:type="dxa"/>
+            </w:tcMar>
+          </w:tcPr>
+          <w:p>
+            <w:pPr>
+              <w:jc w:val="left"/>
+            </w:pPr>
+            <w:r>
+              <w:rPr>
+                <w:rFonts w:ascii="SimSun" w:hAnsi="SimSun" w:eastAsia="SimSun"/>
+                <w:b w:val="0"/>
+                <w:color w:val="183153"/>
+                <w:sz w:val="17"/>
+              </w:rPr>
+              <w:t>360 Hz / 8 bit</w:t>
+            </w:r>
+          </w:p>
+        </w:tc>
+        <w:tc>
+          <w:tcPr>
+            <w:tcW w:type="dxa" w:w="1296"/>
+            <w:vAlign w:val="center"/>
+            <w:tcMar>
+              <w:top w:w="90" w:type="dxa"/>
+              <w:start w:w="110" w:type="dxa"/>
+              <w:bottom w:w="90" w:type="dxa"/>
+              <w:end w:w="110" w:type="dxa"/>
+            </w:tcMar>
+          </w:tcPr>
+          <w:p>
+            <w:pPr>
+              <w:jc w:val="center"/>
+            </w:pPr>
+            <w:r>
+              <w:rPr>
+                <w:rFonts w:ascii="SimSun" w:hAnsi="SimSun" w:eastAsia="SimSun"/>
+                <w:b w:val="0"/>
+                <w:color w:val="183153"/>
+                <w:sz w:val="17"/>
+              </w:rPr>
+              <w:t>0.00</w:t>
+            </w:r>
+          </w:p>
+        </w:tc>
+        <w:tc>
+          <w:tcPr>
+            <w:tcW w:type="dxa" w:w="1296"/>
+            <w:vAlign w:val="center"/>
+            <w:tcMar>
+              <w:top w:w="90" w:type="dxa"/>
+              <w:start w:w="110" w:type="dxa"/>
+              <w:bottom w:w="90" w:type="dxa"/>
+              <w:end w:w="110" w:type="dxa"/>
+            </w:tcMar>
+          </w:tcPr>
+          <w:p>
+            <w:pPr>
+              <w:jc w:val="center"/>
+            </w:pPr>
+            <w:r>
+              <w:rPr>
+                <w:rFonts w:ascii="SimSun" w:hAnsi="SimSun" w:eastAsia="SimSun"/>
+                <w:b w:val="0"/>
+                <w:color w:val="183153"/>
+                <w:sz w:val="17"/>
+              </w:rPr>
+              <w:t>0.000</w:t>
+            </w:r>
+          </w:p>
+        </w:tc>
+        <w:tc>
+          <w:tcPr>
+            <w:tcW w:type="dxa" w:w="1296"/>
+            <w:vAlign w:val="center"/>
+            <w:tcMar>
+              <w:top w:w="90" w:type="dxa"/>
+              <w:start w:w="110" w:type="dxa"/>
+              <w:bottom w:w="90" w:type="dxa"/>
+              <w:end w:w="110" w:type="dxa"/>
+            </w:tcMar>
+          </w:tcPr>
+          <w:p>
+            <w:pPr>
+              <w:jc w:val="center"/>
+            </w:pPr>
+            <w:r>
+              <w:rPr>
+                <w:rFonts w:ascii="SimSun" w:hAnsi="SimSun" w:eastAsia="SimSun"/>
+                <w:b w:val="0"/>
+                <w:color w:val="183153"/>
+                <w:sz w:val="17"/>
+              </w:rPr>
+              <w:t>99.73</w:t>
+            </w:r>
+          </w:p>
+        </w:tc>
+        <w:tc>
+          <w:tcPr>
+            <w:tcW w:type="dxa" w:w="1296"/>
+            <w:vAlign w:val="center"/>
+            <w:tcMar>
+              <w:top w:w="90" w:type="dxa"/>
+              <w:start w:w="110" w:type="dxa"/>
+              <w:bottom w:w="90" w:type="dxa"/>
+              <w:end w:w="110" w:type="dxa"/>
+            </w:tcMar>
+          </w:tcPr>
+          <w:p>
+            <w:pPr>
+              <w:jc w:val="center"/>
+            </w:pPr>
+            <w:r>
+              <w:rPr>
+                <w:rFonts w:ascii="SimSun" w:hAnsi="SimSun" w:eastAsia="SimSun"/>
+                <w:b w:val="0"/>
+                <w:color w:val="183153"/>
+                <w:sz w:val="17"/>
+              </w:rPr>
+              <w:t>0.32</w:t>
+            </w:r>
+          </w:p>
+        </w:tc>
+        <w:tc>
+          <w:tcPr>
+            <w:tcW w:type="dxa" w:w="1296"/>
+            <w:vAlign w:val="center"/>
+            <w:tcMar>
+              <w:top w:w="90" w:type="dxa"/>
+              <w:start w:w="110" w:type="dxa"/>
+              <w:bottom w:w="90" w:type="dxa"/>
+              <w:end w:w="110" w:type="dxa"/>
+            </w:tcMar>
+          </w:tcPr>
+          <w:p>
+            <w:pPr>
+              <w:jc w:val="center"/>
+            </w:pPr>
+            <w:r>
+              <w:rPr>
+                <w:rFonts w:ascii="SimSun" w:hAnsi="SimSun" w:eastAsia="SimSun"/>
+                <w:b w:val="0"/>
+                <w:color w:val="183153"/>
+                <w:sz w:val="17"/>
+              </w:rPr>
+              <w:t>0.62</w:t>
+            </w:r>
+          </w:p>
+        </w:tc>
+        <w:tc>
+          <w:tcPr>
+            <w:tcW w:type="dxa" w:w="1296"/>
+            <w:vAlign w:val="center"/>
+            <w:tcMar>
+              <w:top w:w="90" w:type="dxa"/>
+              <w:start w:w="110" w:type="dxa"/>
+              <w:bottom w:w="90" w:type="dxa"/>
+              <w:end w:w="110" w:type="dxa"/>
+            </w:tcMar>
+          </w:tcPr>
+          <w:p>
+            <w:pPr>
+              <w:jc w:val="center"/>
+            </w:pPr>
+            <w:r>
+              <w:rPr>
+                <w:rFonts w:ascii="SimSun" w:hAnsi="SimSun" w:eastAsia="SimSun"/>
+                <w:b w:val="0"/>
+                <w:color w:val="183153"/>
+                <w:sz w:val="17"/>
+              </w:rPr>
+              <w:t>64.6%</w:t>
+            </w:r>
+          </w:p>
+        </w:tc>
+      </w:tr>
+      <w:tr>
+        <w:tc>
+          <w:tcPr>
+            <w:tcW w:type="dxa" w:w="1296"/>
+            <w:vAlign w:val="center"/>
+            <w:tcMar>
+              <w:top w:w="90" w:type="dxa"/>
+              <w:start w:w="110" w:type="dxa"/>
+              <w:bottom w:w="90" w:type="dxa"/>
+              <w:end w:w="110" w:type="dxa"/>
+            </w:tcMar>
+            <w:shd w:fill="F4F8FC"/>
+          </w:tcPr>
+          <w:p>
+            <w:pPr>
+              <w:jc w:val="left"/>
+            </w:pPr>
+            <w:r>
+              <w:rPr>
+                <w:rFonts w:ascii="SimSun" w:hAnsi="SimSun" w:eastAsia="SimSun"/>
+                <w:b w:val="0"/>
+                <w:color w:val="183153"/>
+                <w:sz w:val="17"/>
+              </w:rPr>
+              <w:t>360 Hz / 7 bit</w:t>
+            </w:r>
+          </w:p>
+        </w:tc>
+        <w:tc>
+          <w:tcPr>
+            <w:tcW w:type="dxa" w:w="1296"/>
+            <w:vAlign w:val="center"/>
+            <w:tcMar>
+              <w:top w:w="90" w:type="dxa"/>
+              <w:start w:w="110" w:type="dxa"/>
+              <w:bottom w:w="90" w:type="dxa"/>
+              <w:end w:w="110" w:type="dxa"/>
+            </w:tcMar>
+            <w:shd w:fill="F4F8FC"/>
+          </w:tcPr>
+          <w:p>
+            <w:pPr>
+              <w:jc w:val="center"/>
+            </w:pPr>
+            <w:r>
+              <w:rPr>
+                <w:rFonts w:ascii="SimSun" w:hAnsi="SimSun" w:eastAsia="SimSun"/>
+                <w:b w:val="0"/>
+                <w:color w:val="183153"/>
+                <w:sz w:val="17"/>
+              </w:rPr>
+              <w:t>0.00</w:t>
+            </w:r>
+          </w:p>
+        </w:tc>
+        <w:tc>
+          <w:tcPr>
+            <w:tcW w:type="dxa" w:w="1296"/>
+            <w:vAlign w:val="center"/>
+            <w:tcMar>
+              <w:top w:w="90" w:type="dxa"/>
+              <w:start w:w="110" w:type="dxa"/>
+              <w:bottom w:w="90" w:type="dxa"/>
+              <w:end w:w="110" w:type="dxa"/>
+            </w:tcMar>
+            <w:shd w:fill="F4F8FC"/>
+          </w:tcPr>
+          <w:p>
+            <w:pPr>
+              <w:jc w:val="center"/>
+            </w:pPr>
+            <w:r>
+              <w:rPr>
+                <w:rFonts w:ascii="SimSun" w:hAnsi="SimSun" w:eastAsia="SimSun"/>
+                <w:b w:val="0"/>
+                <w:color w:val="183153"/>
+                <w:sz w:val="17"/>
+              </w:rPr>
+              <w:t>0.000</w:t>
+            </w:r>
+          </w:p>
+        </w:tc>
+        <w:tc>
+          <w:tcPr>
+            <w:tcW w:type="dxa" w:w="1296"/>
+            <w:vAlign w:val="center"/>
+            <w:tcMar>
+              <w:top w:w="90" w:type="dxa"/>
+              <w:start w:w="110" w:type="dxa"/>
+              <w:bottom w:w="90" w:type="dxa"/>
+              <w:end w:w="110" w:type="dxa"/>
+            </w:tcMar>
+            <w:shd w:fill="F4F8FC"/>
+          </w:tcPr>
+          <w:p>
+            <w:pPr>
+              <w:jc w:val="center"/>
+            </w:pPr>
+            <w:r>
+              <w:rPr>
+                <w:rFonts w:ascii="SimSun" w:hAnsi="SimSun" w:eastAsia="SimSun"/>
+                <w:b w:val="0"/>
+                <w:color w:val="183153"/>
+                <w:sz w:val="17"/>
+              </w:rPr>
+              <w:t>99.70</w:t>
+            </w:r>
+          </w:p>
+        </w:tc>
+        <w:tc>
+          <w:tcPr>
+            <w:tcW w:type="dxa" w:w="1296"/>
+            <w:vAlign w:val="center"/>
+            <w:tcMar>
+              <w:top w:w="90" w:type="dxa"/>
+              <w:start w:w="110" w:type="dxa"/>
+              <w:bottom w:w="90" w:type="dxa"/>
+              <w:end w:w="110" w:type="dxa"/>
+            </w:tcMar>
+            <w:shd w:fill="F4F8FC"/>
+          </w:tcPr>
+          <w:p>
+            <w:pPr>
+              <w:jc w:val="center"/>
+            </w:pPr>
+            <w:r>
+              <w:rPr>
+                <w:rFonts w:ascii="SimSun" w:hAnsi="SimSun" w:eastAsia="SimSun"/>
+                <w:b w:val="0"/>
+                <w:color w:val="183153"/>
+                <w:sz w:val="17"/>
+              </w:rPr>
+              <w:t>0.31</w:t>
+            </w:r>
+          </w:p>
+        </w:tc>
+        <w:tc>
+          <w:tcPr>
+            <w:tcW w:type="dxa" w:w="1296"/>
+            <w:vAlign w:val="center"/>
+            <w:tcMar>
+              <w:top w:w="90" w:type="dxa"/>
+              <w:start w:w="110" w:type="dxa"/>
+              <w:bottom w:w="90" w:type="dxa"/>
+              <w:end w:w="110" w:type="dxa"/>
+            </w:tcMar>
+            <w:shd w:fill="F4F8FC"/>
+          </w:tcPr>
+          <w:p>
+            <w:pPr>
+              <w:jc w:val="center"/>
+            </w:pPr>
+            <w:r>
+              <w:rPr>
+                <w:rFonts w:ascii="SimSun" w:hAnsi="SimSun" w:eastAsia="SimSun"/>
+                <w:b w:val="0"/>
+                <w:color w:val="183153"/>
+                <w:sz w:val="17"/>
+              </w:rPr>
+              <w:t>0.63</w:t>
+            </w:r>
+          </w:p>
+        </w:tc>
+        <w:tc>
+          <w:tcPr>
+            <w:tcW w:type="dxa" w:w="1296"/>
+            <w:vAlign w:val="center"/>
+            <w:tcMar>
+              <w:top w:w="90" w:type="dxa"/>
+              <w:start w:w="110" w:type="dxa"/>
+              <w:bottom w:w="90" w:type="dxa"/>
+              <w:end w:w="110" w:type="dxa"/>
+            </w:tcMar>
+            <w:shd w:fill="F4F8FC"/>
+          </w:tcPr>
+          <w:p>
+            <w:pPr>
+              <w:jc w:val="center"/>
+            </w:pPr>
+            <w:r>
+              <w:rPr>
+                <w:rFonts w:ascii="SimSun" w:hAnsi="SimSun" w:eastAsia="SimSun"/>
+                <w:b w:val="0"/>
+                <w:color w:val="183153"/>
+                <w:sz w:val="17"/>
+              </w:rPr>
+              <w:t>64.6%</w:t>
+            </w:r>
+          </w:p>
+        </w:tc>
+      </w:tr>
+      <w:tr>
+        <w:tc>
+          <w:tcPr>
+            <w:tcW w:type="dxa" w:w="1296"/>
+            <w:vAlign w:val="center"/>
+            <w:tcMar>
+              <w:top w:w="90" w:type="dxa"/>
+              <w:start w:w="110" w:type="dxa"/>
+              <w:bottom w:w="90" w:type="dxa"/>
+              <w:end w:w="110" w:type="dxa"/>
+            </w:tcMar>
+          </w:tcPr>
+          <w:p>
+            <w:pPr>
+              <w:jc w:val="left"/>
+            </w:pPr>
+            <w:r>
+              <w:rPr>
+                <w:rFonts w:ascii="SimSun" w:hAnsi="SimSun" w:eastAsia="SimSun"/>
+                <w:b w:val="0"/>
+                <w:color w:val="183153"/>
+                <w:sz w:val="17"/>
+              </w:rPr>
+              <w:t>360 Hz / 6 bit</w:t>
+            </w:r>
+          </w:p>
+        </w:tc>
+        <w:tc>
+          <w:tcPr>
+            <w:tcW w:type="dxa" w:w="1296"/>
+            <w:vAlign w:val="center"/>
+            <w:tcMar>
+              <w:top w:w="90" w:type="dxa"/>
+              <w:start w:w="110" w:type="dxa"/>
+              <w:bottom w:w="90" w:type="dxa"/>
+              <w:end w:w="110" w:type="dxa"/>
+            </w:tcMar>
+          </w:tcPr>
+          <w:p>
+            <w:pPr>
+              <w:jc w:val="center"/>
+            </w:pPr>
+            <w:r>
+              <w:rPr>
+                <w:rFonts w:ascii="SimSun" w:hAnsi="SimSun" w:eastAsia="SimSun"/>
+                <w:b w:val="0"/>
+                <w:color w:val="183153"/>
+                <w:sz w:val="17"/>
+              </w:rPr>
+              <w:t>0.00</w:t>
+            </w:r>
+          </w:p>
+        </w:tc>
+        <w:tc>
+          <w:tcPr>
+            <w:tcW w:type="dxa" w:w="1296"/>
+            <w:vAlign w:val="center"/>
+            <w:tcMar>
+              <w:top w:w="90" w:type="dxa"/>
+              <w:start w:w="110" w:type="dxa"/>
+              <w:bottom w:w="90" w:type="dxa"/>
+              <w:end w:w="110" w:type="dxa"/>
+            </w:tcMar>
+          </w:tcPr>
+          <w:p>
+            <w:pPr>
+              <w:jc w:val="center"/>
+            </w:pPr>
+            <w:r>
+              <w:rPr>
+                <w:rFonts w:ascii="SimSun" w:hAnsi="SimSun" w:eastAsia="SimSun"/>
+                <w:b w:val="0"/>
+                <w:color w:val="183153"/>
+                <w:sz w:val="17"/>
+              </w:rPr>
+              <w:t>0.000</w:t>
+            </w:r>
+          </w:p>
+        </w:tc>
+        <w:tc>
+          <w:tcPr>
+            <w:tcW w:type="dxa" w:w="1296"/>
+            <w:vAlign w:val="center"/>
+            <w:tcMar>
+              <w:top w:w="90" w:type="dxa"/>
+              <w:start w:w="110" w:type="dxa"/>
+              <w:bottom w:w="90" w:type="dxa"/>
+              <w:end w:w="110" w:type="dxa"/>
+            </w:tcMar>
+          </w:tcPr>
+          <w:p>
+            <w:pPr>
+              <w:jc w:val="center"/>
+            </w:pPr>
+            <w:r>
+              <w:rPr>
+                <w:rFonts w:ascii="SimSun" w:hAnsi="SimSun" w:eastAsia="SimSun"/>
+                <w:b w:val="0"/>
+                <w:color w:val="183153"/>
+                <w:sz w:val="17"/>
+              </w:rPr>
+              <w:t>99.73</w:t>
+            </w:r>
+          </w:p>
+        </w:tc>
+        <w:tc>
+          <w:tcPr>
+            <w:tcW w:type="dxa" w:w="1296"/>
+            <w:vAlign w:val="center"/>
+            <w:tcMar>
+              <w:top w:w="90" w:type="dxa"/>
+              <w:start w:w="110" w:type="dxa"/>
+              <w:bottom w:w="90" w:type="dxa"/>
+              <w:end w:w="110" w:type="dxa"/>
+            </w:tcMar>
+          </w:tcPr>
+          <w:p>
+            <w:pPr>
+              <w:jc w:val="center"/>
+            </w:pPr>
+            <w:r>
+              <w:rPr>
+                <w:rFonts w:ascii="SimSun" w:hAnsi="SimSun" w:eastAsia="SimSun"/>
+                <w:b w:val="0"/>
+                <w:color w:val="183153"/>
+                <w:sz w:val="17"/>
+              </w:rPr>
+              <w:t>0.32</w:t>
+            </w:r>
+          </w:p>
+        </w:tc>
+        <w:tc>
+          <w:tcPr>
+            <w:tcW w:type="dxa" w:w="1296"/>
+            <w:vAlign w:val="center"/>
+            <w:tcMar>
+              <w:top w:w="90" w:type="dxa"/>
+              <w:start w:w="110" w:type="dxa"/>
+              <w:bottom w:w="90" w:type="dxa"/>
+              <w:end w:w="110" w:type="dxa"/>
+            </w:tcMar>
+          </w:tcPr>
+          <w:p>
+            <w:pPr>
+              <w:jc w:val="center"/>
+            </w:pPr>
+            <w:r>
+              <w:rPr>
+                <w:rFonts w:ascii="SimSun" w:hAnsi="SimSun" w:eastAsia="SimSun"/>
+                <w:b w:val="0"/>
+                <w:color w:val="183153"/>
+                <w:sz w:val="17"/>
+              </w:rPr>
+              <w:t>0.82</w:t>
+            </w:r>
+          </w:p>
+        </w:tc>
+        <w:tc>
+          <w:tcPr>
+            <w:tcW w:type="dxa" w:w="1296"/>
+            <w:vAlign w:val="center"/>
+            <w:tcMar>
+              <w:top w:w="90" w:type="dxa"/>
+              <w:start w:w="110" w:type="dxa"/>
+              <w:bottom w:w="90" w:type="dxa"/>
+              <w:end w:w="110" w:type="dxa"/>
+            </w:tcMar>
+          </w:tcPr>
+          <w:p>
+            <w:pPr>
+              <w:jc w:val="center"/>
+            </w:pPr>
+            <w:r>
+              <w:rPr>
+                <w:rFonts w:ascii="SimSun" w:hAnsi="SimSun" w:eastAsia="SimSun"/>
+                <w:b w:val="0"/>
+                <w:color w:val="183153"/>
+                <w:sz w:val="17"/>
+              </w:rPr>
+              <w:t>60.4%</w:t>
+            </w:r>
+          </w:p>
+        </w:tc>
+      </w:tr>
+      <w:tr>
+        <w:tc>
+          <w:tcPr>
+            <w:tcW w:type="dxa" w:w="1296"/>
+            <w:vAlign w:val="center"/>
+            <w:tcMar>
+              <w:top w:w="90" w:type="dxa"/>
+              <w:start w:w="110" w:type="dxa"/>
+              <w:bottom w:w="90" w:type="dxa"/>
+              <w:end w:w="110" w:type="dxa"/>
+            </w:tcMar>
+            <w:shd w:fill="F4F8FC"/>
+          </w:tcPr>
+          <w:p>
+            <w:pPr>
+              <w:jc w:val="left"/>
+            </w:pPr>
+            <w:r>
+              <w:rPr>
+                <w:rFonts w:ascii="SimSun" w:hAnsi="SimSun" w:eastAsia="SimSun"/>
+                <w:b w:val="0"/>
+                <w:color w:val="183153"/>
+                <w:sz w:val="17"/>
+              </w:rPr>
+              <w:t>180 Hz / 8 bit</w:t>
+            </w:r>
+          </w:p>
+        </w:tc>
+        <w:tc>
+          <w:tcPr>
+            <w:tcW w:type="dxa" w:w="1296"/>
+            <w:vAlign w:val="center"/>
+            <w:tcMar>
+              <w:top w:w="90" w:type="dxa"/>
+              <w:start w:w="110" w:type="dxa"/>
+              <w:bottom w:w="90" w:type="dxa"/>
+              <w:end w:w="110" w:type="dxa"/>
+            </w:tcMar>
+            <w:shd w:fill="F4F8FC"/>
+          </w:tcPr>
+          <w:p>
+            <w:pPr>
+              <w:jc w:val="center"/>
+            </w:pPr>
+            <w:r>
+              <w:rPr>
+                <w:rFonts w:ascii="SimSun" w:hAnsi="SimSun" w:eastAsia="SimSun"/>
+                <w:b w:val="0"/>
+                <w:color w:val="183153"/>
+                <w:sz w:val="17"/>
+              </w:rPr>
+              <w:t>2.78</w:t>
+            </w:r>
+          </w:p>
+        </w:tc>
+        <w:tc>
+          <w:tcPr>
+            <w:tcW w:type="dxa" w:w="1296"/>
+            <w:vAlign w:val="center"/>
+            <w:tcMar>
+              <w:top w:w="90" w:type="dxa"/>
+              <w:start w:w="110" w:type="dxa"/>
+              <w:bottom w:w="90" w:type="dxa"/>
+              <w:end w:w="110" w:type="dxa"/>
+            </w:tcMar>
+            <w:shd w:fill="F4F8FC"/>
+          </w:tcPr>
+          <w:p>
+            <w:pPr>
+              <w:jc w:val="center"/>
+            </w:pPr>
+            <w:r>
+              <w:rPr>
+                <w:rFonts w:ascii="SimSun" w:hAnsi="SimSun" w:eastAsia="SimSun"/>
+                <w:b w:val="0"/>
+                <w:color w:val="183153"/>
+                <w:sz w:val="17"/>
+              </w:rPr>
+              <w:t>0.244</w:t>
+            </w:r>
+          </w:p>
+        </w:tc>
+        <w:tc>
+          <w:tcPr>
+            <w:tcW w:type="dxa" w:w="1296"/>
+            <w:vAlign w:val="center"/>
+            <w:tcMar>
+              <w:top w:w="90" w:type="dxa"/>
+              <w:start w:w="110" w:type="dxa"/>
+              <w:bottom w:w="90" w:type="dxa"/>
+              <w:end w:w="110" w:type="dxa"/>
+            </w:tcMar>
+            <w:shd w:fill="F4F8FC"/>
+          </w:tcPr>
+          <w:p>
+            <w:pPr>
+              <w:jc w:val="center"/>
+            </w:pPr>
+            <w:r>
+              <w:rPr>
+                <w:rFonts w:ascii="SimSun" w:hAnsi="SimSun" w:eastAsia="SimSun"/>
+                <w:b w:val="0"/>
+                <w:color w:val="183153"/>
+                <w:sz w:val="17"/>
+              </w:rPr>
+              <w:t>99.75</w:t>
+            </w:r>
+          </w:p>
+        </w:tc>
+        <w:tc>
+          <w:tcPr>
+            <w:tcW w:type="dxa" w:w="1296"/>
+            <w:vAlign w:val="center"/>
+            <w:tcMar>
+              <w:top w:w="90" w:type="dxa"/>
+              <w:start w:w="110" w:type="dxa"/>
+              <w:bottom w:w="90" w:type="dxa"/>
+              <w:end w:w="110" w:type="dxa"/>
+            </w:tcMar>
+            <w:shd w:fill="F4F8FC"/>
+          </w:tcPr>
+          <w:p>
+            <w:pPr>
+              <w:jc w:val="center"/>
+            </w:pPr>
+            <w:r>
+              <w:rPr>
+                <w:rFonts w:ascii="SimSun" w:hAnsi="SimSun" w:eastAsia="SimSun"/>
+                <w:b w:val="0"/>
+                <w:color w:val="183153"/>
+                <w:sz w:val="17"/>
+              </w:rPr>
+              <w:t>0.33</w:t>
+            </w:r>
+          </w:p>
+        </w:tc>
+        <w:tc>
+          <w:tcPr>
+            <w:tcW w:type="dxa" w:w="1296"/>
+            <w:vAlign w:val="center"/>
+            <w:tcMar>
+              <w:top w:w="90" w:type="dxa"/>
+              <w:start w:w="110" w:type="dxa"/>
+              <w:bottom w:w="90" w:type="dxa"/>
+              <w:end w:w="110" w:type="dxa"/>
+            </w:tcMar>
+            <w:shd w:fill="F4F8FC"/>
+          </w:tcPr>
+          <w:p>
+            <w:pPr>
+              <w:jc w:val="center"/>
+            </w:pPr>
+            <w:r>
+              <w:rPr>
+                <w:rFonts w:ascii="SimSun" w:hAnsi="SimSun" w:eastAsia="SimSun"/>
+                <w:b w:val="0"/>
+                <w:color w:val="183153"/>
+                <w:sz w:val="17"/>
+              </w:rPr>
+              <w:t>0.79</w:t>
+            </w:r>
+          </w:p>
+        </w:tc>
+        <w:tc>
+          <w:tcPr>
+            <w:tcW w:type="dxa" w:w="1296"/>
+            <w:vAlign w:val="center"/>
+            <w:tcMar>
+              <w:top w:w="90" w:type="dxa"/>
+              <w:start w:w="110" w:type="dxa"/>
+              <w:bottom w:w="90" w:type="dxa"/>
+              <w:end w:w="110" w:type="dxa"/>
+            </w:tcMar>
+            <w:shd w:fill="F4F8FC"/>
+          </w:tcPr>
+          <w:p>
+            <w:pPr>
+              <w:jc w:val="center"/>
+            </w:pPr>
+            <w:r>
+              <w:rPr>
+                <w:rFonts w:ascii="SimSun" w:hAnsi="SimSun" w:eastAsia="SimSun"/>
+                <w:b w:val="0"/>
+                <w:color w:val="183153"/>
+                <w:sz w:val="17"/>
+              </w:rPr>
+              <w:t>66.7%</w:t>
+            </w:r>
+          </w:p>
+        </w:tc>
+      </w:tr>
+      <w:tr>
+        <w:tc>
+          <w:tcPr>
+            <w:tcW w:type="dxa" w:w="1296"/>
+            <w:vAlign w:val="center"/>
+            <w:tcMar>
+              <w:top w:w="90" w:type="dxa"/>
+              <w:start w:w="110" w:type="dxa"/>
+              <w:bottom w:w="90" w:type="dxa"/>
+              <w:end w:w="110" w:type="dxa"/>
+            </w:tcMar>
+          </w:tcPr>
+          <w:p>
+            <w:pPr>
+              <w:jc w:val="left"/>
+            </w:pPr>
+            <w:r>
+              <w:rPr>
+                <w:rFonts w:ascii="SimSun" w:hAnsi="SimSun" w:eastAsia="SimSun"/>
+                <w:b w:val="0"/>
+                <w:color w:val="183153"/>
+                <w:sz w:val="17"/>
+              </w:rPr>
+              <w:t>125 Hz / 8 bit</w:t>
+            </w:r>
+          </w:p>
+        </w:tc>
+        <w:tc>
+          <w:tcPr>
+            <w:tcW w:type="dxa" w:w="1296"/>
+            <w:vAlign w:val="center"/>
+            <w:tcMar>
+              <w:top w:w="90" w:type="dxa"/>
+              <w:start w:w="110" w:type="dxa"/>
+              <w:bottom w:w="90" w:type="dxa"/>
+              <w:end w:w="110" w:type="dxa"/>
+            </w:tcMar>
+          </w:tcPr>
+          <w:p>
+            <w:pPr>
+              <w:jc w:val="center"/>
+            </w:pPr>
+            <w:r>
+              <w:rPr>
+                <w:rFonts w:ascii="SimSun" w:hAnsi="SimSun" w:eastAsia="SimSun"/>
+                <w:b w:val="0"/>
+                <w:color w:val="183153"/>
+                <w:sz w:val="17"/>
+              </w:rPr>
+              <w:t>2.72</w:t>
+            </w:r>
+          </w:p>
+        </w:tc>
+        <w:tc>
+          <w:tcPr>
+            <w:tcW w:type="dxa" w:w="1296"/>
+            <w:vAlign w:val="center"/>
+            <w:tcMar>
+              <w:top w:w="90" w:type="dxa"/>
+              <w:start w:w="110" w:type="dxa"/>
+              <w:bottom w:w="90" w:type="dxa"/>
+              <w:end w:w="110" w:type="dxa"/>
+            </w:tcMar>
+          </w:tcPr>
+          <w:p>
+            <w:pPr>
+              <w:jc w:val="center"/>
+            </w:pPr>
+            <w:r>
+              <w:rPr>
+                <w:rFonts w:ascii="SimSun" w:hAnsi="SimSun" w:eastAsia="SimSun"/>
+                <w:b w:val="0"/>
+                <w:color w:val="183153"/>
+                <w:sz w:val="17"/>
+              </w:rPr>
+              <w:t>0.314</w:t>
+            </w:r>
+          </w:p>
+        </w:tc>
+        <w:tc>
+          <w:tcPr>
+            <w:tcW w:type="dxa" w:w="1296"/>
+            <w:vAlign w:val="center"/>
+            <w:tcMar>
+              <w:top w:w="90" w:type="dxa"/>
+              <w:start w:w="110" w:type="dxa"/>
+              <w:bottom w:w="90" w:type="dxa"/>
+              <w:end w:w="110" w:type="dxa"/>
+            </w:tcMar>
+          </w:tcPr>
+          <w:p>
+            <w:pPr>
+              <w:jc w:val="center"/>
+            </w:pPr>
+            <w:r>
+              <w:rPr>
+                <w:rFonts w:ascii="SimSun" w:hAnsi="SimSun" w:eastAsia="SimSun"/>
+                <w:b w:val="0"/>
+                <w:color w:val="183153"/>
+                <w:sz w:val="17"/>
+              </w:rPr>
+              <w:t>99.77</w:t>
+            </w:r>
+          </w:p>
+        </w:tc>
+        <w:tc>
+          <w:tcPr>
+            <w:tcW w:type="dxa" w:w="1296"/>
+            <w:vAlign w:val="center"/>
+            <w:tcMar>
+              <w:top w:w="90" w:type="dxa"/>
+              <w:start w:w="110" w:type="dxa"/>
+              <w:bottom w:w="90" w:type="dxa"/>
+              <w:end w:w="110" w:type="dxa"/>
+            </w:tcMar>
+          </w:tcPr>
+          <w:p>
+            <w:pPr>
+              <w:jc w:val="center"/>
+            </w:pPr>
+            <w:r>
+              <w:rPr>
+                <w:rFonts w:ascii="SimSun" w:hAnsi="SimSun" w:eastAsia="SimSun"/>
+                <w:b w:val="0"/>
+                <w:color w:val="183153"/>
+                <w:sz w:val="17"/>
+              </w:rPr>
+              <w:t>1.43</w:t>
+            </w:r>
+          </w:p>
+        </w:tc>
+        <w:tc>
+          <w:tcPr>
+            <w:tcW w:type="dxa" w:w="1296"/>
+            <w:vAlign w:val="center"/>
+            <w:tcMar>
+              <w:top w:w="90" w:type="dxa"/>
+              <w:start w:w="110" w:type="dxa"/>
+              <w:bottom w:w="90" w:type="dxa"/>
+              <w:end w:w="110" w:type="dxa"/>
+            </w:tcMar>
+          </w:tcPr>
+          <w:p>
+            <w:pPr>
+              <w:jc w:val="center"/>
+            </w:pPr>
+            <w:r>
+              <w:rPr>
+                <w:rFonts w:ascii="SimSun" w:hAnsi="SimSun" w:eastAsia="SimSun"/>
+                <w:b w:val="0"/>
+                <w:color w:val="183153"/>
+                <w:sz w:val="17"/>
+              </w:rPr>
+              <w:t>3.37</w:t>
+            </w:r>
+          </w:p>
+        </w:tc>
+        <w:tc>
+          <w:tcPr>
+            <w:tcW w:type="dxa" w:w="1296"/>
+            <w:vAlign w:val="center"/>
+            <w:tcMar>
+              <w:top w:w="90" w:type="dxa"/>
+              <w:start w:w="110" w:type="dxa"/>
+              <w:bottom w:w="90" w:type="dxa"/>
+              <w:end w:w="110" w:type="dxa"/>
+            </w:tcMar>
+          </w:tcPr>
+          <w:p>
+            <w:pPr>
+              <w:jc w:val="center"/>
+            </w:pPr>
+            <w:r>
+              <w:rPr>
+                <w:rFonts w:ascii="SimSun" w:hAnsi="SimSun" w:eastAsia="SimSun"/>
+                <w:b w:val="0"/>
+                <w:color w:val="183153"/>
+                <w:sz w:val="17"/>
+              </w:rPr>
+              <w:t>43.8%</w:t>
+            </w:r>
+          </w:p>
+        </w:tc>
+      </w:tr>
+      <w:tr>
+        <w:tc>
+          <w:tcPr>
+            <w:tcW w:type="dxa" w:w="1296"/>
+            <w:vAlign w:val="center"/>
+            <w:tcMar>
+              <w:top w:w="90" w:type="dxa"/>
+              <w:start w:w="110" w:type="dxa"/>
+              <w:bottom w:w="90" w:type="dxa"/>
+              <w:end w:w="110" w:type="dxa"/>
+            </w:tcMar>
+            <w:shd w:fill="F4F8FC"/>
+          </w:tcPr>
+          <w:p>
+            <w:pPr>
+              <w:jc w:val="left"/>
+            </w:pPr>
+            <w:r>
+              <w:rPr>
+                <w:rFonts w:ascii="SimSun" w:hAnsi="SimSun" w:eastAsia="SimSun"/>
+                <w:b w:val="0"/>
+                <w:color w:val="183153"/>
+                <w:sz w:val="17"/>
+              </w:rPr>
+              <w:t>100 Hz / 6 bit</w:t>
+            </w:r>
+          </w:p>
+        </w:tc>
+        <w:tc>
+          <w:tcPr>
+            <w:tcW w:type="dxa" w:w="1296"/>
+            <w:vAlign w:val="center"/>
+            <w:tcMar>
+              <w:top w:w="90" w:type="dxa"/>
+              <w:start w:w="110" w:type="dxa"/>
+              <w:bottom w:w="90" w:type="dxa"/>
+              <w:end w:w="110" w:type="dxa"/>
+            </w:tcMar>
+            <w:shd w:fill="F4F8FC"/>
+          </w:tcPr>
+          <w:p>
+            <w:pPr>
+              <w:jc w:val="center"/>
+            </w:pPr>
+            <w:r>
+              <w:rPr>
+                <w:rFonts w:ascii="SimSun" w:hAnsi="SimSun" w:eastAsia="SimSun"/>
+                <w:b w:val="0"/>
+                <w:color w:val="183153"/>
+                <w:sz w:val="17"/>
+              </w:rPr>
+              <w:t>6.67</w:t>
+            </w:r>
+          </w:p>
+        </w:tc>
+        <w:tc>
+          <w:tcPr>
+            <w:tcW w:type="dxa" w:w="1296"/>
+            <w:vAlign w:val="center"/>
+            <w:tcMar>
+              <w:top w:w="90" w:type="dxa"/>
+              <w:start w:w="110" w:type="dxa"/>
+              <w:bottom w:w="90" w:type="dxa"/>
+              <w:end w:w="110" w:type="dxa"/>
+            </w:tcMar>
+            <w:shd w:fill="F4F8FC"/>
+          </w:tcPr>
+          <w:p>
+            <w:pPr>
+              <w:jc w:val="center"/>
+            </w:pPr>
+            <w:r>
+              <w:rPr>
+                <w:rFonts w:ascii="SimSun" w:hAnsi="SimSun" w:eastAsia="SimSun"/>
+                <w:b w:val="0"/>
+                <w:color w:val="183153"/>
+                <w:sz w:val="17"/>
+              </w:rPr>
+              <w:t>0.635</w:t>
+            </w:r>
+          </w:p>
+        </w:tc>
+        <w:tc>
+          <w:tcPr>
+            <w:tcW w:type="dxa" w:w="1296"/>
+            <w:vAlign w:val="center"/>
+            <w:tcMar>
+              <w:top w:w="90" w:type="dxa"/>
+              <w:start w:w="110" w:type="dxa"/>
+              <w:bottom w:w="90" w:type="dxa"/>
+              <w:end w:w="110" w:type="dxa"/>
+            </w:tcMar>
+            <w:shd w:fill="F4F8FC"/>
+          </w:tcPr>
+          <w:p>
+            <w:pPr>
+              <w:jc w:val="center"/>
+            </w:pPr>
+            <w:r>
+              <w:rPr>
+                <w:rFonts w:ascii="SimSun" w:hAnsi="SimSun" w:eastAsia="SimSun"/>
+                <w:b w:val="0"/>
+                <w:color w:val="183153"/>
+                <w:sz w:val="17"/>
+              </w:rPr>
+              <w:t>99.56</w:t>
+            </w:r>
+          </w:p>
+        </w:tc>
+        <w:tc>
+          <w:tcPr>
+            <w:tcW w:type="dxa" w:w="1296"/>
+            <w:vAlign w:val="center"/>
+            <w:tcMar>
+              <w:top w:w="90" w:type="dxa"/>
+              <w:start w:w="110" w:type="dxa"/>
+              <w:bottom w:w="90" w:type="dxa"/>
+              <w:end w:w="110" w:type="dxa"/>
+            </w:tcMar>
+            <w:shd w:fill="F4F8FC"/>
+          </w:tcPr>
+          <w:p>
+            <w:pPr>
+              <w:jc w:val="center"/>
+            </w:pPr>
+            <w:r>
+              <w:rPr>
+                <w:rFonts w:ascii="SimSun" w:hAnsi="SimSun" w:eastAsia="SimSun"/>
+                <w:b w:val="0"/>
+                <w:color w:val="183153"/>
+                <w:sz w:val="17"/>
+              </w:rPr>
+              <w:t>9.18</w:t>
+            </w:r>
+          </w:p>
+        </w:tc>
+        <w:tc>
+          <w:tcPr>
+            <w:tcW w:type="dxa" w:w="1296"/>
+            <w:vAlign w:val="center"/>
+            <w:tcMar>
+              <w:top w:w="90" w:type="dxa"/>
+              <w:start w:w="110" w:type="dxa"/>
+              <w:bottom w:w="90" w:type="dxa"/>
+              <w:end w:w="110" w:type="dxa"/>
+            </w:tcMar>
+            <w:shd w:fill="F4F8FC"/>
+          </w:tcPr>
+          <w:p>
+            <w:pPr>
+              <w:jc w:val="center"/>
+            </w:pPr>
+            <w:r>
+              <w:rPr>
+                <w:rFonts w:ascii="SimSun" w:hAnsi="SimSun" w:eastAsia="SimSun"/>
+                <w:b w:val="0"/>
+                <w:color w:val="183153"/>
+                <w:sz w:val="17"/>
+              </w:rPr>
+              <w:t>18.36</w:t>
+            </w:r>
+          </w:p>
+        </w:tc>
+        <w:tc>
+          <w:tcPr>
+            <w:tcW w:type="dxa" w:w="1296"/>
+            <w:vAlign w:val="center"/>
+            <w:tcMar>
+              <w:top w:w="90" w:type="dxa"/>
+              <w:start w:w="110" w:type="dxa"/>
+              <w:bottom w:w="90" w:type="dxa"/>
+              <w:end w:w="110" w:type="dxa"/>
+            </w:tcMar>
+            <w:shd w:fill="F4F8FC"/>
+          </w:tcPr>
+          <w:p>
+            <w:pPr>
+              <w:jc w:val="center"/>
+            </w:pPr>
+            <w:r>
+              <w:rPr>
+                <w:rFonts w:ascii="SimSun" w:hAnsi="SimSun" w:eastAsia="SimSun"/>
+                <w:b w:val="0"/>
+                <w:color w:val="183153"/>
+                <w:sz w:val="17"/>
+              </w:rPr>
+              <w:t>10.4%</w:t>
+            </w:r>
+          </w:p>
+        </w:tc>
+      </w:tr>
+    </w:tbl>
+    <w:p>
+      <w:pPr>
+        <w:spacing w:after="40"/>
+      </w:pPr>
+    </w:p>
+    <w:p>
+      <w:pPr>
+        <w:spacing w:after="120" w:line="307" w:lineRule="auto"/>
+        <w:jc w:val="both"/>
+      </w:pPr>
+      <w:r>
+        <w:rPr>
+          <w:rFonts w:ascii="SimSun" w:hAnsi="SimSun" w:eastAsia="SimSun"/>
+          <w:b w:val="0"/>
+          <w:color w:val="183153"/>
+          <w:sz w:val="21"/>
+        </w:rPr>
+        <w:t>表10　面向不同医学监护场景的配置建议</w:t>
+      </w:r>
+    </w:p>
+    <w:tbl>
+      <w:tblPr>
+        <w:tblStyle w:val="TableGrid"/>
+        <w:tblW w:type="auto" w:w="0"/>
+        <w:jc w:val="center"/>
+        <w:tblLayout w:type="fixed"/>
+        <w:tblLook w:firstColumn="1" w:firstRow="1" w:lastColumn="0" w:lastRow="0" w:noHBand="0" w:noVBand="1" w:val="04A0"/>
+      </w:tblPr>
+      <w:tblGrid>
+        <w:gridCol w:w="1930"/>
+        <w:gridCol w:w="1930"/>
+        <w:gridCol w:w="1930"/>
+        <w:gridCol w:w="1930"/>
+        <w:gridCol w:w="1930"/>
+      </w:tblGrid>
+      <w:tr>
+        <w:trPr>
+          <w:tblHeader w:val="true"/>
+        </w:trPr>
+        <w:tc>
+          <w:tcPr>
+            <w:tcW w:type="dxa" w:w="1843"/>
+            <w:vAlign w:val="center"/>
+            <w:shd w:fill="276FBF"/>
+            <w:tcMar>
+              <w:top w:w="90" w:type="dxa"/>
+              <w:start w:w="110" w:type="dxa"/>
+              <w:bottom w:w="90" w:type="dxa"/>
+              <w:end w:w="110" w:type="dxa"/>
+            </w:tcMar>
+          </w:tcPr>
+          <w:p>
+            <w:pPr>
+              <w:jc w:val="center"/>
+            </w:pPr>
+            <w:r>
+              <w:rPr>
+                <w:rFonts w:ascii="Microsoft YaHei" w:hAnsi="Microsoft YaHei" w:eastAsia="Microsoft YaHei"/>
+                <w:b/>
+                <w:color w:val="FFFFFF"/>
+                <w:sz w:val="18"/>
+              </w:rPr>
+              <w:t>监护场景</w:t>
+            </w:r>
+          </w:p>
+        </w:tc>
+        <w:tc>
+          <w:tcPr>
+            <w:tcW w:type="dxa" w:w="1512"/>
+            <w:vAlign w:val="center"/>
+            <w:shd w:fill="276FBF"/>
+            <w:tcMar>
+              <w:top w:w="90" w:type="dxa"/>
+              <w:start w:w="110" w:type="dxa"/>
+              <w:bottom w:w="90" w:type="dxa"/>
+              <w:end w:w="110" w:type="dxa"/>
+            </w:tcMar>
+          </w:tcPr>
+          <w:p>
+            <w:pPr>
+              <w:jc w:val="center"/>
+            </w:pPr>
+            <w:r>
+              <w:rPr>
+                <w:rFonts w:ascii="Microsoft YaHei" w:hAnsi="Microsoft YaHei" w:eastAsia="Microsoft YaHei"/>
+                <w:b/>
+                <w:color w:val="FFFFFF"/>
+                <w:sz w:val="18"/>
+              </w:rPr>
+              <w:t>推荐等级</w:t>
+            </w:r>
+          </w:p>
+        </w:tc>
+        <w:tc>
+          <w:tcPr>
+            <w:tcW w:type="dxa" w:w="1757"/>
+            <w:vAlign w:val="center"/>
+            <w:shd w:fill="276FBF"/>
+            <w:tcMar>
+              <w:top w:w="90" w:type="dxa"/>
+              <w:start w:w="110" w:type="dxa"/>
+              <w:bottom w:w="90" w:type="dxa"/>
+              <w:end w:w="110" w:type="dxa"/>
+            </w:tcMar>
+          </w:tcPr>
+          <w:p>
+            <w:pPr>
+              <w:jc w:val="center"/>
+            </w:pPr>
+            <w:r>
+              <w:rPr>
+                <w:rFonts w:ascii="Microsoft YaHei" w:hAnsi="Microsoft YaHei" w:eastAsia="Microsoft YaHei"/>
+                <w:b/>
+                <w:color w:val="FFFFFF"/>
+                <w:sz w:val="18"/>
+              </w:rPr>
+              <w:t>配置</w:t>
+            </w:r>
+          </w:p>
+        </w:tc>
+        <w:tc>
+          <w:tcPr>
+            <w:tcW w:type="dxa" w:w="1800"/>
+            <w:vAlign w:val="center"/>
+            <w:shd w:fill="276FBF"/>
+            <w:tcMar>
+              <w:top w:w="90" w:type="dxa"/>
+              <w:start w:w="110" w:type="dxa"/>
+              <w:bottom w:w="90" w:type="dxa"/>
+              <w:end w:w="110" w:type="dxa"/>
+            </w:tcMar>
+          </w:tcPr>
+          <w:p>
+            <w:pPr>
+              <w:jc w:val="center"/>
+            </w:pPr>
+            <w:r>
+              <w:rPr>
+                <w:rFonts w:ascii="Microsoft YaHei" w:hAnsi="Microsoft YaHei" w:eastAsia="Microsoft YaHei"/>
+                <w:b/>
+                <w:color w:val="FFFFFF"/>
+                <w:sz w:val="18"/>
+              </w:rPr>
+              <w:t>关键证据</w:t>
+            </w:r>
+          </w:p>
+        </w:tc>
+        <w:tc>
+          <w:tcPr>
+            <w:tcW w:type="dxa" w:w="2088"/>
+            <w:vAlign w:val="center"/>
+            <w:shd w:fill="276FBF"/>
+            <w:tcMar>
+              <w:top w:w="90" w:type="dxa"/>
+              <w:start w:w="110" w:type="dxa"/>
+              <w:bottom w:w="90" w:type="dxa"/>
+              <w:end w:w="110" w:type="dxa"/>
+            </w:tcMar>
+          </w:tcPr>
+          <w:p>
+            <w:pPr>
+              <w:jc w:val="center"/>
+            </w:pPr>
+            <w:r>
+              <w:rPr>
+                <w:rFonts w:ascii="Microsoft YaHei" w:hAnsi="Microsoft YaHei" w:eastAsia="Microsoft YaHei"/>
+                <w:b/>
+                <w:color w:val="FFFFFF"/>
+                <w:sz w:val="18"/>
+              </w:rPr>
+              <w:t>边界说明</w:t>
+            </w:r>
+          </w:p>
+        </w:tc>
+      </w:tr>
+      <w:tr>
+        <w:tc>
+          <w:tcPr>
+            <w:tcW w:type="dxa" w:w="1843"/>
+            <w:vAlign w:val="center"/>
+            <w:tcMar>
+              <w:top w:w="90" w:type="dxa"/>
+              <w:start w:w="110" w:type="dxa"/>
+              <w:bottom w:w="90" w:type="dxa"/>
+              <w:end w:w="110" w:type="dxa"/>
+            </w:tcMar>
+            <w:shd w:fill="F4F8FC"/>
+          </w:tcPr>
+          <w:p>
+            <w:pPr>
+              <w:jc w:val="left"/>
+            </w:pPr>
+            <w:r>
+              <w:rPr>
+                <w:rFonts w:ascii="SimSun" w:hAnsi="SimSun" w:eastAsia="SimSun"/>
+                <w:b w:val="0"/>
+                <w:color w:val="183153"/>
+                <w:sz w:val="17"/>
+              </w:rPr>
+              <w:t>HR/RR 长时监护</w:t>
+            </w:r>
+          </w:p>
+        </w:tc>
+        <w:tc>
+          <w:tcPr>
+            <w:tcW w:type="dxa" w:w="1512"/>
+            <w:vAlign w:val="center"/>
+            <w:tcMar>
+              <w:top w:w="90" w:type="dxa"/>
+              <w:start w:w="110" w:type="dxa"/>
+              <w:bottom w:w="90" w:type="dxa"/>
+              <w:end w:w="110" w:type="dxa"/>
+            </w:tcMar>
+            <w:shd w:fill="F4F8FC"/>
+          </w:tcPr>
+          <w:p>
+            <w:pPr>
+              <w:jc w:val="center"/>
+            </w:pPr>
+            <w:r>
+              <w:rPr>
+                <w:rFonts w:ascii="SimSun" w:hAnsi="SimSun" w:eastAsia="SimSun"/>
+                <w:b w:val="0"/>
+                <w:color w:val="183153"/>
+                <w:sz w:val="17"/>
+              </w:rPr>
+              <w:t>推荐</w:t>
+            </w:r>
+          </w:p>
+        </w:tc>
+        <w:tc>
+          <w:tcPr>
+            <w:tcW w:type="dxa" w:w="1757"/>
+            <w:vAlign w:val="center"/>
+            <w:tcMar>
+              <w:top w:w="90" w:type="dxa"/>
+              <w:start w:w="110" w:type="dxa"/>
+              <w:bottom w:w="90" w:type="dxa"/>
+              <w:end w:w="110" w:type="dxa"/>
+            </w:tcMar>
+            <w:shd w:fill="F4F8FC"/>
+          </w:tcPr>
+          <w:p>
+            <w:pPr>
+              <w:jc w:val="center"/>
+            </w:pPr>
+            <w:r>
+              <w:rPr>
+                <w:rFonts w:ascii="SimSun" w:hAnsi="SimSun" w:eastAsia="SimSun"/>
+                <w:b w:val="0"/>
+                <w:color w:val="183153"/>
+                <w:sz w:val="17"/>
+              </w:rPr>
+              <w:t>360 Hz / 6 bit</w:t>
+            </w:r>
+          </w:p>
+        </w:tc>
+        <w:tc>
+          <w:tcPr>
+            <w:tcW w:type="dxa" w:w="1800"/>
+            <w:vAlign w:val="center"/>
+            <w:tcMar>
+              <w:top w:w="90" w:type="dxa"/>
+              <w:start w:w="110" w:type="dxa"/>
+              <w:bottom w:w="90" w:type="dxa"/>
+              <w:end w:w="110" w:type="dxa"/>
+            </w:tcMar>
+            <w:shd w:fill="F4F8FC"/>
+          </w:tcPr>
+          <w:p>
+            <w:pPr>
+              <w:jc w:val="center"/>
+            </w:pPr>
+            <w:r>
+              <w:rPr>
+                <w:rFonts w:ascii="SimSun" w:hAnsi="SimSun" w:eastAsia="SimSun"/>
+                <w:b w:val="0"/>
+                <w:color w:val="183153"/>
+                <w:sz w:val="17"/>
+              </w:rPr>
+              <w:t>Clean F1 99.305%; 原始码率 2160 bit/s; RR误差中位数 0.00 ms</w:t>
+            </w:r>
+          </w:p>
+        </w:tc>
+        <w:tc>
+          <w:tcPr>
+            <w:tcW w:type="dxa" w:w="2088"/>
+            <w:vAlign w:val="center"/>
+            <w:tcMar>
+              <w:top w:w="90" w:type="dxa"/>
+              <w:start w:w="110" w:type="dxa"/>
+              <w:bottom w:w="90" w:type="dxa"/>
+              <w:end w:w="110" w:type="dxa"/>
+            </w:tcMar>
+            <w:shd w:fill="F4F8FC"/>
+          </w:tcPr>
+          <w:p>
+            <w:pPr>
+              <w:jc w:val="center"/>
+            </w:pPr>
+            <w:r>
+              <w:rPr>
+                <w:rFonts w:ascii="SimSun" w:hAnsi="SimSun" w:eastAsia="SimSun"/>
+                <w:b w:val="0"/>
+                <w:color w:val="183153"/>
+                <w:sz w:val="17"/>
+              </w:rPr>
+              <w:t>适合心率与RR间期趋势监护，不作为诊断系统。</w:t>
+            </w:r>
+          </w:p>
+        </w:tc>
+      </w:tr>
+      <w:tr>
+        <w:tc>
+          <w:tcPr>
+            <w:tcW w:type="dxa" w:w="1843"/>
+            <w:vAlign w:val="center"/>
+            <w:tcMar>
+              <w:top w:w="90" w:type="dxa"/>
+              <w:start w:w="110" w:type="dxa"/>
+              <w:bottom w:w="90" w:type="dxa"/>
+              <w:end w:w="110" w:type="dxa"/>
+            </w:tcMar>
+          </w:tcPr>
+          <w:p>
+            <w:pPr>
+              <w:jc w:val="left"/>
+            </w:pPr>
+            <w:r>
+              <w:rPr>
+                <w:rFonts w:ascii="SimSun" w:hAnsi="SimSun" w:eastAsia="SimSun"/>
+                <w:b w:val="0"/>
+                <w:color w:val="183153"/>
+                <w:sz w:val="17"/>
+              </w:rPr>
+              <w:t>HRV 趋势观察</w:t>
+            </w:r>
+          </w:p>
+        </w:tc>
+        <w:tc>
+          <w:tcPr>
+            <w:tcW w:type="dxa" w:w="1512"/>
+            <w:vAlign w:val="center"/>
+            <w:tcMar>
+              <w:top w:w="90" w:type="dxa"/>
+              <w:start w:w="110" w:type="dxa"/>
+              <w:bottom w:w="90" w:type="dxa"/>
+              <w:end w:w="110" w:type="dxa"/>
+            </w:tcMar>
+          </w:tcPr>
+          <w:p>
+            <w:pPr>
+              <w:jc w:val="center"/>
+            </w:pPr>
+            <w:r>
+              <w:rPr>
+                <w:rFonts w:ascii="SimSun" w:hAnsi="SimSun" w:eastAsia="SimSun"/>
+                <w:b w:val="0"/>
+                <w:color w:val="183153"/>
+                <w:sz w:val="17"/>
+              </w:rPr>
+              <w:t>谨慎</w:t>
+            </w:r>
+          </w:p>
+        </w:tc>
+        <w:tc>
+          <w:tcPr>
+            <w:tcW w:type="dxa" w:w="1757"/>
+            <w:vAlign w:val="center"/>
+            <w:tcMar>
+              <w:top w:w="90" w:type="dxa"/>
+              <w:start w:w="110" w:type="dxa"/>
+              <w:bottom w:w="90" w:type="dxa"/>
+              <w:end w:w="110" w:type="dxa"/>
+            </w:tcMar>
+          </w:tcPr>
+          <w:p>
+            <w:pPr>
+              <w:jc w:val="center"/>
+            </w:pPr>
+            <w:r>
+              <w:rPr>
+                <w:rFonts w:ascii="SimSun" w:hAnsi="SimSun" w:eastAsia="SimSun"/>
+                <w:b w:val="0"/>
+                <w:color w:val="183153"/>
+                <w:sz w:val="17"/>
+              </w:rPr>
+              <w:t>不适用</w:t>
+            </w:r>
+          </w:p>
+        </w:tc>
+        <w:tc>
+          <w:tcPr>
+            <w:tcW w:type="dxa" w:w="1800"/>
+            <w:vAlign w:val="center"/>
+            <w:tcMar>
+              <w:top w:w="90" w:type="dxa"/>
+              <w:start w:w="110" w:type="dxa"/>
+              <w:bottom w:w="90" w:type="dxa"/>
+              <w:end w:w="110" w:type="dxa"/>
+            </w:tcMar>
+          </w:tcPr>
+          <w:p>
+            <w:pPr>
+              <w:jc w:val="center"/>
+            </w:pPr>
+            <w:r>
+              <w:rPr>
+                <w:rFonts w:ascii="SimSun" w:hAnsi="SimSun" w:eastAsia="SimSun"/>
+                <w:b w:val="0"/>
+                <w:color w:val="183153"/>
+                <w:sz w:val="17"/>
+              </w:rPr>
+              <w:t>没有低数据率配置同时满足全部HRV趋势阈值。</w:t>
+            </w:r>
+          </w:p>
+        </w:tc>
+        <w:tc>
+          <w:tcPr>
+            <w:tcW w:type="dxa" w:w="2088"/>
+            <w:vAlign w:val="center"/>
+            <w:tcMar>
+              <w:top w:w="90" w:type="dxa"/>
+              <w:start w:w="110" w:type="dxa"/>
+              <w:bottom w:w="90" w:type="dxa"/>
+              <w:end w:w="110" w:type="dxa"/>
+            </w:tcMar>
+          </w:tcPr>
+          <w:p>
+            <w:pPr>
+              <w:jc w:val="center"/>
+            </w:pPr>
+            <w:r>
+              <w:rPr>
+                <w:rFonts w:ascii="SimSun" w:hAnsi="SimSun" w:eastAsia="SimSun"/>
+                <w:b w:val="0"/>
+                <w:color w:val="183153"/>
+                <w:sz w:val="17"/>
+              </w:rPr>
+              <w:t>HRV仅作为技术信号质量指标，不解释疾病风险。</w:t>
+            </w:r>
+          </w:p>
+        </w:tc>
+      </w:tr>
+      <w:tr>
+        <w:tc>
+          <w:tcPr>
+            <w:tcW w:type="dxa" w:w="1843"/>
+            <w:vAlign w:val="center"/>
+            <w:tcMar>
+              <w:top w:w="90" w:type="dxa"/>
+              <w:start w:w="110" w:type="dxa"/>
+              <w:bottom w:w="90" w:type="dxa"/>
+              <w:end w:w="110" w:type="dxa"/>
+            </w:tcMar>
+            <w:shd w:fill="F4F8FC"/>
+          </w:tcPr>
+          <w:p>
+            <w:pPr>
+              <w:jc w:val="left"/>
+            </w:pPr>
+            <w:r>
+              <w:rPr>
+                <w:rFonts w:ascii="SimSun" w:hAnsi="SimSun" w:eastAsia="SimSun"/>
+                <w:b w:val="0"/>
+                <w:color w:val="183153"/>
+                <w:sz w:val="17"/>
+              </w:rPr>
+              <w:t>运动/噪声优先监护</w:t>
+            </w:r>
+          </w:p>
+        </w:tc>
+        <w:tc>
+          <w:tcPr>
+            <w:tcW w:type="dxa" w:w="1512"/>
+            <w:vAlign w:val="center"/>
+            <w:tcMar>
+              <w:top w:w="90" w:type="dxa"/>
+              <w:start w:w="110" w:type="dxa"/>
+              <w:bottom w:w="90" w:type="dxa"/>
+              <w:end w:w="110" w:type="dxa"/>
+            </w:tcMar>
+            <w:shd w:fill="F4F8FC"/>
+          </w:tcPr>
+          <w:p>
+            <w:pPr>
+              <w:jc w:val="center"/>
+            </w:pPr>
+            <w:r>
+              <w:rPr>
+                <w:rFonts w:ascii="SimSun" w:hAnsi="SimSun" w:eastAsia="SimSun"/>
+                <w:b w:val="0"/>
+                <w:color w:val="183153"/>
+                <w:sz w:val="17"/>
+              </w:rPr>
+              <w:t>推荐</w:t>
+            </w:r>
+          </w:p>
+        </w:tc>
+        <w:tc>
+          <w:tcPr>
+            <w:tcW w:type="dxa" w:w="1757"/>
+            <w:vAlign w:val="center"/>
+            <w:tcMar>
+              <w:top w:w="90" w:type="dxa"/>
+              <w:start w:w="110" w:type="dxa"/>
+              <w:bottom w:w="90" w:type="dxa"/>
+              <w:end w:w="110" w:type="dxa"/>
+            </w:tcMar>
+            <w:shd w:fill="F4F8FC"/>
+          </w:tcPr>
+          <w:p>
+            <w:pPr>
+              <w:jc w:val="center"/>
+            </w:pPr>
+            <w:r>
+              <w:rPr>
+                <w:rFonts w:ascii="SimSun" w:hAnsi="SimSun" w:eastAsia="SimSun"/>
+                <w:b w:val="0"/>
+                <w:color w:val="183153"/>
+                <w:sz w:val="17"/>
+              </w:rPr>
+              <w:t>360 Hz / 7 bit</w:t>
+            </w:r>
+          </w:p>
+        </w:tc>
+        <w:tc>
+          <w:tcPr>
+            <w:tcW w:type="dxa" w:w="1800"/>
+            <w:vAlign w:val="center"/>
+            <w:tcMar>
+              <w:top w:w="90" w:type="dxa"/>
+              <w:start w:w="110" w:type="dxa"/>
+              <w:bottom w:w="90" w:type="dxa"/>
+              <w:end w:w="110" w:type="dxa"/>
+            </w:tcMar>
+            <w:shd w:fill="F4F8FC"/>
+          </w:tcPr>
+          <w:p>
+            <w:pPr>
+              <w:jc w:val="center"/>
+            </w:pPr>
+            <w:r>
+              <w:rPr>
+                <w:rFonts w:ascii="SimSun" w:hAnsi="SimSun" w:eastAsia="SimSun"/>
+                <w:b w:val="0"/>
+                <w:color w:val="183153"/>
+                <w:sz w:val="17"/>
+              </w:rPr>
+              <w:t>Clean F1 99.378%; 原始码率 2520 bit/s; SNR&gt;=6 dB最坏F1下降 0.065 pp</w:t>
+            </w:r>
+          </w:p>
+        </w:tc>
+        <w:tc>
+          <w:tcPr>
+            <w:tcW w:type="dxa" w:w="2088"/>
+            <w:vAlign w:val="center"/>
+            <w:tcMar>
+              <w:top w:w="90" w:type="dxa"/>
+              <w:start w:w="110" w:type="dxa"/>
+              <w:bottom w:w="90" w:type="dxa"/>
+              <w:end w:w="110" w:type="dxa"/>
+            </w:tcMar>
+            <w:shd w:fill="F4F8FC"/>
+          </w:tcPr>
+          <w:p>
+            <w:pPr>
+              <w:jc w:val="center"/>
+            </w:pPr>
+            <w:r>
+              <w:rPr>
+                <w:rFonts w:ascii="SimSun" w:hAnsi="SimSun" w:eastAsia="SimSun"/>
+                <w:b w:val="0"/>
+                <w:color w:val="183153"/>
+                <w:sz w:val="17"/>
+              </w:rPr>
+              <w:t>适合把标准运动伪影鲁棒性放在最低码率之前的场景。</w:t>
+            </w:r>
+          </w:p>
+        </w:tc>
+      </w:tr>
+      <w:tr>
+        <w:tc>
+          <w:tcPr>
+            <w:tcW w:type="dxa" w:w="1843"/>
+            <w:vAlign w:val="center"/>
+            <w:tcMar>
+              <w:top w:w="90" w:type="dxa"/>
+              <w:start w:w="110" w:type="dxa"/>
+              <w:bottom w:w="90" w:type="dxa"/>
+              <w:end w:w="110" w:type="dxa"/>
+            </w:tcMar>
+          </w:tcPr>
+          <w:p>
+            <w:pPr>
+              <w:jc w:val="left"/>
+            </w:pPr>
+            <w:r>
+              <w:rPr>
+                <w:rFonts w:ascii="SimSun" w:hAnsi="SimSun" w:eastAsia="SimSun"/>
+                <w:b w:val="0"/>
+                <w:color w:val="183153"/>
+                <w:sz w:val="17"/>
+              </w:rPr>
+              <w:t>极低数据率教学/静息探索</w:t>
+            </w:r>
+          </w:p>
+        </w:tc>
+        <w:tc>
+          <w:tcPr>
+            <w:tcW w:type="dxa" w:w="1512"/>
+            <w:vAlign w:val="center"/>
+            <w:tcMar>
+              <w:top w:w="90" w:type="dxa"/>
+              <w:start w:w="110" w:type="dxa"/>
+              <w:bottom w:w="90" w:type="dxa"/>
+              <w:end w:w="110" w:type="dxa"/>
+            </w:tcMar>
+          </w:tcPr>
+          <w:p>
+            <w:pPr>
+              <w:jc w:val="center"/>
+            </w:pPr>
+            <w:r>
+              <w:rPr>
+                <w:rFonts w:ascii="SimSun" w:hAnsi="SimSun" w:eastAsia="SimSun"/>
+                <w:b w:val="0"/>
+                <w:color w:val="183153"/>
+                <w:sz w:val="17"/>
+              </w:rPr>
+              <w:t>限定</w:t>
+            </w:r>
+          </w:p>
+        </w:tc>
+        <w:tc>
+          <w:tcPr>
+            <w:tcW w:type="dxa" w:w="1757"/>
+            <w:vAlign w:val="center"/>
+            <w:tcMar>
+              <w:top w:w="90" w:type="dxa"/>
+              <w:start w:w="110" w:type="dxa"/>
+              <w:bottom w:w="90" w:type="dxa"/>
+              <w:end w:w="110" w:type="dxa"/>
+            </w:tcMar>
+          </w:tcPr>
+          <w:p>
+            <w:pPr>
+              <w:jc w:val="center"/>
+            </w:pPr>
+            <w:r>
+              <w:rPr>
+                <w:rFonts w:ascii="SimSun" w:hAnsi="SimSun" w:eastAsia="SimSun"/>
+                <w:b w:val="0"/>
+                <w:color w:val="183153"/>
+                <w:sz w:val="17"/>
+              </w:rPr>
+              <w:t>125 Hz / 6 bit</w:t>
+            </w:r>
+          </w:p>
+        </w:tc>
+        <w:tc>
+          <w:tcPr>
+            <w:tcW w:type="dxa" w:w="1800"/>
+            <w:vAlign w:val="center"/>
+            <w:tcMar>
+              <w:top w:w="90" w:type="dxa"/>
+              <w:start w:w="110" w:type="dxa"/>
+              <w:bottom w:w="90" w:type="dxa"/>
+              <w:end w:w="110" w:type="dxa"/>
+            </w:tcMar>
+          </w:tcPr>
+          <w:p>
+            <w:pPr>
+              <w:jc w:val="center"/>
+            </w:pPr>
+            <w:r>
+              <w:rPr>
+                <w:rFonts w:ascii="SimSun" w:hAnsi="SimSun" w:eastAsia="SimSun"/>
+                <w:b w:val="0"/>
+                <w:color w:val="183153"/>
+                <w:sz w:val="17"/>
+              </w:rPr>
+              <w:t>Clean F1 98.743%; 原始码率 750 bit/s; SNR&gt;=6 dB最坏F1下降 7.835 pp</w:t>
+            </w:r>
+          </w:p>
+        </w:tc>
+        <w:tc>
+          <w:tcPr>
+            <w:tcW w:type="dxa" w:w="2088"/>
+            <w:vAlign w:val="center"/>
+            <w:tcMar>
+              <w:top w:w="90" w:type="dxa"/>
+              <w:start w:w="110" w:type="dxa"/>
+              <w:bottom w:w="90" w:type="dxa"/>
+              <w:end w:w="110" w:type="dxa"/>
+            </w:tcMar>
+          </w:tcPr>
+          <w:p>
+            <w:pPr>
+              <w:jc w:val="center"/>
+            </w:pPr>
+            <w:r>
+              <w:rPr>
+                <w:rFonts w:ascii="SimSun" w:hAnsi="SimSun" w:eastAsia="SimSun"/>
+                <w:b w:val="0"/>
+                <w:color w:val="183153"/>
+                <w:sz w:val="17"/>
+              </w:rPr>
+              <w:t>可用于展示参数权衡，不适合运动场景或鲁棒监护。</w:t>
+            </w:r>
+          </w:p>
+        </w:tc>
+      </w:tr>
+      <w:tr>
+        <w:tc>
+          <w:tcPr>
+            <w:tcW w:type="dxa" w:w="1843"/>
+            <w:vAlign w:val="center"/>
+            <w:tcMar>
+              <w:top w:w="90" w:type="dxa"/>
+              <w:start w:w="110" w:type="dxa"/>
+              <w:bottom w:w="90" w:type="dxa"/>
+              <w:end w:w="110" w:type="dxa"/>
+            </w:tcMar>
+            <w:shd w:fill="F4F8FC"/>
+          </w:tcPr>
+          <w:p>
+            <w:pPr>
+              <w:jc w:val="left"/>
+            </w:pPr>
+            <w:r>
+              <w:rPr>
+                <w:rFonts w:ascii="SimSun" w:hAnsi="SimSun" w:eastAsia="SimSun"/>
+                <w:b w:val="0"/>
+                <w:color w:val="183153"/>
+                <w:sz w:val="17"/>
+              </w:rPr>
+              <w:t>ST/形态/临床诊断</w:t>
+            </w:r>
+          </w:p>
+        </w:tc>
+        <w:tc>
+          <w:tcPr>
+            <w:tcW w:type="dxa" w:w="1512"/>
+            <w:vAlign w:val="center"/>
+            <w:tcMar>
+              <w:top w:w="90" w:type="dxa"/>
+              <w:start w:w="110" w:type="dxa"/>
+              <w:bottom w:w="90" w:type="dxa"/>
+              <w:end w:w="110" w:type="dxa"/>
+            </w:tcMar>
+            <w:shd w:fill="F4F8FC"/>
+          </w:tcPr>
+          <w:p>
+            <w:pPr>
+              <w:jc w:val="center"/>
+            </w:pPr>
+            <w:r>
+              <w:rPr>
+                <w:rFonts w:ascii="SimSun" w:hAnsi="SimSun" w:eastAsia="SimSun"/>
+                <w:b w:val="0"/>
+                <w:color w:val="183153"/>
+                <w:sz w:val="17"/>
+              </w:rPr>
+              <w:t>范围外</w:t>
+            </w:r>
+          </w:p>
+        </w:tc>
+        <w:tc>
+          <w:tcPr>
+            <w:tcW w:type="dxa" w:w="1757"/>
+            <w:vAlign w:val="center"/>
+            <w:tcMar>
+              <w:top w:w="90" w:type="dxa"/>
+              <w:start w:w="110" w:type="dxa"/>
+              <w:bottom w:w="90" w:type="dxa"/>
+              <w:end w:w="110" w:type="dxa"/>
+            </w:tcMar>
+            <w:shd w:fill="F4F8FC"/>
+          </w:tcPr>
+          <w:p>
+            <w:pPr>
+              <w:jc w:val="center"/>
+            </w:pPr>
+            <w:r>
+              <w:rPr>
+                <w:rFonts w:ascii="SimSun" w:hAnsi="SimSun" w:eastAsia="SimSun"/>
+                <w:b w:val="0"/>
+                <w:color w:val="183153"/>
+                <w:sz w:val="17"/>
+              </w:rPr>
+              <w:t>不适用</w:t>
+            </w:r>
+          </w:p>
+        </w:tc>
+        <w:tc>
+          <w:tcPr>
+            <w:tcW w:type="dxa" w:w="1800"/>
+            <w:vAlign w:val="center"/>
+            <w:tcMar>
+              <w:top w:w="90" w:type="dxa"/>
+              <w:start w:w="110" w:type="dxa"/>
+              <w:bottom w:w="90" w:type="dxa"/>
+              <w:end w:w="110" w:type="dxa"/>
+            </w:tcMar>
+            <w:shd w:fill="F4F8FC"/>
+          </w:tcPr>
+          <w:p>
+            <w:pPr>
+              <w:jc w:val="center"/>
+            </w:pPr>
+            <w:r>
+              <w:rPr>
+                <w:rFonts w:ascii="SimSun" w:hAnsi="SimSun" w:eastAsia="SimSun"/>
+                <w:b w:val="0"/>
+                <w:color w:val="183153"/>
+                <w:sz w:val="17"/>
+              </w:rPr>
+              <w:t>本项目不评价ST段、形态诊断、心律失常分类或临床决策。</w:t>
+            </w:r>
+          </w:p>
+        </w:tc>
+        <w:tc>
+          <w:tcPr>
+            <w:tcW w:type="dxa" w:w="2088"/>
+            <w:vAlign w:val="center"/>
+            <w:tcMar>
+              <w:top w:w="90" w:type="dxa"/>
+              <w:start w:w="110" w:type="dxa"/>
+              <w:bottom w:w="90" w:type="dxa"/>
+              <w:end w:w="110" w:type="dxa"/>
+            </w:tcMar>
+            <w:shd w:fill="F4F8FC"/>
+          </w:tcPr>
+          <w:p>
+            <w:pPr>
+              <w:jc w:val="center"/>
+            </w:pPr>
+            <w:r>
+              <w:rPr>
+                <w:rFonts w:ascii="SimSun" w:hAnsi="SimSun" w:eastAsia="SimSun"/>
+                <w:b w:val="0"/>
+                <w:color w:val="183153"/>
+                <w:sz w:val="17"/>
+              </w:rPr>
+              <w:t>设计范围外。</w:t>
+            </w:r>
+          </w:p>
+        </w:tc>
+      </w:tr>
+    </w:tbl>
+    <w:p>
+      <w:pPr>
+        <w:spacing w:after="40"/>
+      </w:pPr>
+    </w:p>
+    <w:p>
+      <w:pPr>
         <w:pStyle w:val="Heading1"/>
       </w:pPr>
       <w:r>
@@ -6888,7 +9551,7 @@
           <w:color w:val="183153"/>
           <w:sz w:val="21"/>
         </w:rPr>
-        <w:t>第一，采样率和位数不应只根据波形视觉效果选择，而应根据具体任务进行联合优化。第二，R峰检出率在干净条件下可能接近性能上限，但时间误差仍能揭示低采样率的代价。第三，强运动伪影下的主要限制逐渐转向检测器鲁棒性与输入污染，而不是ADC位数本身。</w:t>
+        <w:t>第一，采样率和位数不应只根据波形视觉效果选择，而应根据具体监护任务进行联合优化。第二，R峰检出率在干净条件下可能接近性能上限，但时间误差、RR误差和心率误差仍能揭示低采样率的代价。第三，强运动伪影下的主要限制逐渐转向检测器鲁棒性与输入污染，而不是ADC位数本身。第四，HRV类指标比单个R峰检出率更依赖连续RR序列完整性，因此只能作为采集参数对节律监护影响的技术分析。</w:t>
       </w:r>
     </w:p>
     <w:p>
@@ -6911,7 +9574,7 @@
           <w:color w:val="183153"/>
           <w:sz w:val="21"/>
         </w:rPr>
-        <w:t>360 Hz / 6 bit适合以心率和RR间期为主的长时监测。数据率降低意味着存储与无线传输负担下降，也可能减少ADC和处理系统的工作量。但本项目没有真实硬件，不能将数据率下降直接写成实测功耗下降。</w:t>
+        <w:t>360 Hz / 6 bit适合以心率和RR间期为主的长时监测。数据率降低意味着存储与无线传输负担下降，也可能减少ADC和处理系统的工作量。但本项目没有真实硬件，不能将数据率下降直接写成实测功耗下降。对于HRV趋势观察，应优先报告RR连续性、SDNN相对误差和RMSSD相对误差，而不是只报告F1。</w:t>
       </w:r>
     </w:p>
     <w:p>
@@ -6934,7 +9597,7 @@
           <w:color w:val="183153"/>
           <w:sz w:val="21"/>
         </w:rPr>
-        <w:t>医学应用限制。 结论仅适用于R峰与RR间期监测，不能外推到ST段分析、形态诊断、心律失常分类或临床决策。真实应用还需要安全性、可靠性、伦理和临床验证。</w:t>
+        <w:t>医学应用限制。 结论仅适用于R峰、RR间期、心率趋势和HRV技术可用性分析，不能外推到ST段分析、形态诊断、心律失常分类或临床决策。真实应用还需要安全性、可靠性、伦理和临床验证。</w:t>
       </w:r>
     </w:p>
     <w:p>
@@ -7002,7 +9665,7 @@
           <w:color w:val="183153"/>
           <w:sz w:val="21"/>
         </w:rPr>
-        <w:t>后续应搭建真实模拟前端与ADC硬件，测量输入保护、共模抑制、实时延迟和实际功耗；加入信号质量指数，在低质量片段拒绝输出；比较因果滤波与不同QRS检测算法；并使用真实可穿戴运动数据进行外部验证。同时可以将交互展示网页扩展为参数设计教学工具，用于展示采样率、量化位数和抗噪性能之间的权衡。</w:t>
+        <w:t>后续应搭建真实模拟前端与ADC硬件，测量输入保护、共模抑制、实时延迟和实际功耗；加入信号质量指数，在低质量片段拒绝输出；比较因果滤波与不同QRS检测算法；并使用真实可穿戴运动数据进行外部验证。同时可以将交互展示网页扩展为参数设计教学工具，用于展示采样率、量化位数、抗噪性能、RR连续性和HRV技术误差之间的权衡。</w:t>
       </w:r>
     </w:p>
     <w:p>
@@ -7025,7 +9688,7 @@
           <w:color w:val="183153"/>
           <w:sz w:val="21"/>
         </w:rPr>
-        <w:t>本项目完成了ECG采样率、ADC有效位数与抗噪性能的全因子联合设计。基于48条动态ECG和12条标准运动伪影记录，推荐360 Hz / 6 bit作为R峰监测任务的工程折中方案。该配置在保持与参考配置接近的R峰检测性能时，将原始数据率降低45.5%。研究结果支持任务导向的低数据率采集设计，同时强调在严重运动伪影、真实因果前端和临床用途方面仍需进一步验证。</w:t>
+        <w:t>本项目完成了ECG采样率、ADC有效位数与抗噪性能的全因子联合设计，并将医学场景从R峰检测扩展到RR间期、心率趋势和HRV技术可用性。基于48条动态ECG和12条标准运动伪影记录，推荐360 Hz / 6 bit作为R峰/RR/心率趋势监测任务的工程折中方案。该配置在保持与参考配置接近的R峰检测性能时，将原始数据率降低45.5%。研究结果支持任务导向的低数据率采集设计，同时强调HRV解释、严重运动伪影、真实因果前端和临床用途仍需进一步验证。</w:t>
       </w:r>
     </w:p>
     <w:p>
@@ -7974,6 +10637,116 @@
                 <w:color w:val="183153"/>
                 <w:sz w:val="17"/>
               </w:rPr>
+              <w:t>src/monitoring_analysis.py</w:t>
+            </w:r>
+          </w:p>
+        </w:tc>
+        <w:tc>
+          <w:tcPr>
+            <w:tcW w:type="dxa" w:w="5904"/>
+            <w:vAlign w:val="center"/>
+            <w:tcMar>
+              <w:top w:w="90" w:type="dxa"/>
+              <w:start w:w="110" w:type="dxa"/>
+              <w:bottom w:w="90" w:type="dxa"/>
+              <w:end w:w="110" w:type="dxa"/>
+            </w:tcMar>
+            <w:shd w:fill="F4F8FC"/>
+          </w:tcPr>
+          <w:p>
+            <w:pPr>
+              <w:jc w:val="center"/>
+            </w:pPr>
+            <w:r>
+              <w:rPr>
+                <w:rFonts w:ascii="SimSun" w:hAnsi="SimSun" w:eastAsia="SimSun"/>
+                <w:b w:val="0"/>
+                <w:color w:val="183153"/>
+                <w:sz w:val="17"/>
+              </w:rPr>
+              <w:t>计算RR、心率和HRV监护指标并生成场景建议</w:t>
+            </w:r>
+          </w:p>
+        </w:tc>
+      </w:tr>
+      <w:tr>
+        <w:tc>
+          <w:tcPr>
+            <w:tcW w:type="dxa" w:w="3168"/>
+            <w:vAlign w:val="center"/>
+            <w:tcMar>
+              <w:top w:w="90" w:type="dxa"/>
+              <w:start w:w="110" w:type="dxa"/>
+              <w:bottom w:w="90" w:type="dxa"/>
+              <w:end w:w="110" w:type="dxa"/>
+            </w:tcMar>
+          </w:tcPr>
+          <w:p>
+            <w:pPr>
+              <w:jc w:val="left"/>
+            </w:pPr>
+            <w:r>
+              <w:rPr>
+                <w:rFonts w:ascii="SimSun" w:hAnsi="SimSun" w:eastAsia="SimSun"/>
+                <w:b w:val="0"/>
+                <w:color w:val="183153"/>
+                <w:sz w:val="17"/>
+              </w:rPr>
+              <w:t>src/build_web_data.py</w:t>
+            </w:r>
+          </w:p>
+        </w:tc>
+        <w:tc>
+          <w:tcPr>
+            <w:tcW w:type="dxa" w:w="5904"/>
+            <w:vAlign w:val="center"/>
+            <w:tcMar>
+              <w:top w:w="90" w:type="dxa"/>
+              <w:start w:w="110" w:type="dxa"/>
+              <w:bottom w:w="90" w:type="dxa"/>
+              <w:end w:w="110" w:type="dxa"/>
+            </w:tcMar>
+          </w:tcPr>
+          <w:p>
+            <w:pPr>
+              <w:jc w:val="center"/>
+            </w:pPr>
+            <w:r>
+              <w:rPr>
+                <w:rFonts w:ascii="SimSun" w:hAnsi="SimSun" w:eastAsia="SimSun"/>
+                <w:b w:val="0"/>
+                <w:color w:val="183153"/>
+                <w:sz w:val="17"/>
+              </w:rPr>
+              <w:t>生成交互网页使用的数据载荷</w:t>
+            </w:r>
+          </w:p>
+        </w:tc>
+      </w:tr>
+      <w:tr>
+        <w:tc>
+          <w:tcPr>
+            <w:tcW w:type="dxa" w:w="3168"/>
+            <w:vAlign w:val="center"/>
+            <w:tcMar>
+              <w:top w:w="90" w:type="dxa"/>
+              <w:start w:w="110" w:type="dxa"/>
+              <w:bottom w:w="90" w:type="dxa"/>
+              <w:end w:w="110" w:type="dxa"/>
+            </w:tcMar>
+            <w:shd w:fill="F4F8FC"/>
+          </w:tcPr>
+          <w:p>
+            <w:pPr>
+              <w:jc w:val="left"/>
+            </w:pPr>
+            <w:r>
+              <w:rPr>
+                <w:rFonts w:ascii="SimSun" w:hAnsi="SimSun" w:eastAsia="SimSun"/>
+                <w:b w:val="0"/>
+                <w:color w:val="183153"/>
+                <w:sz w:val="17"/>
+              </w:rPr>
               <w:t>src/build_report.py</w:t>
             </w:r>
           </w:p>
@@ -8390,6 +11163,116 @@
                 <w:color w:val="183153"/>
                 <w:sz w:val="17"/>
               </w:rPr>
+              <w:t>results/monitoring_summary.csv</w:t>
+            </w:r>
+          </w:p>
+        </w:tc>
+        <w:tc>
+          <w:tcPr>
+            <w:tcW w:type="dxa" w:w="5904"/>
+            <w:vAlign w:val="center"/>
+            <w:tcMar>
+              <w:top w:w="90" w:type="dxa"/>
+              <w:start w:w="110" w:type="dxa"/>
+              <w:bottom w:w="90" w:type="dxa"/>
+              <w:end w:w="110" w:type="dxa"/>
+            </w:tcMar>
+          </w:tcPr>
+          <w:p>
+            <w:pPr>
+              <w:jc w:val="center"/>
+            </w:pPr>
+            <w:r>
+              <w:rPr>
+                <w:rFonts w:ascii="SimSun" w:hAnsi="SimSun" w:eastAsia="SimSun"/>
+                <w:b w:val="0"/>
+                <w:color w:val="183153"/>
+                <w:sz w:val="17"/>
+              </w:rPr>
+              <w:t>RR、心率和HRV配置级监护指标</w:t>
+            </w:r>
+          </w:p>
+        </w:tc>
+      </w:tr>
+      <w:tr>
+        <w:tc>
+          <w:tcPr>
+            <w:tcW w:type="dxa" w:w="3168"/>
+            <w:vAlign w:val="center"/>
+            <w:tcMar>
+              <w:top w:w="90" w:type="dxa"/>
+              <w:start w:w="110" w:type="dxa"/>
+              <w:bottom w:w="90" w:type="dxa"/>
+              <w:end w:w="110" w:type="dxa"/>
+            </w:tcMar>
+            <w:shd w:fill="F4F8FC"/>
+          </w:tcPr>
+          <w:p>
+            <w:pPr>
+              <w:jc w:val="left"/>
+            </w:pPr>
+            <w:r>
+              <w:rPr>
+                <w:rFonts w:ascii="SimSun" w:hAnsi="SimSun" w:eastAsia="SimSun"/>
+                <w:b w:val="0"/>
+                <w:color w:val="183153"/>
+                <w:sz w:val="17"/>
+              </w:rPr>
+              <w:t>results/scenario_recommendations.json</w:t>
+            </w:r>
+          </w:p>
+        </w:tc>
+        <w:tc>
+          <w:tcPr>
+            <w:tcW w:type="dxa" w:w="5904"/>
+            <w:vAlign w:val="center"/>
+            <w:tcMar>
+              <w:top w:w="90" w:type="dxa"/>
+              <w:start w:w="110" w:type="dxa"/>
+              <w:bottom w:w="90" w:type="dxa"/>
+              <w:end w:w="110" w:type="dxa"/>
+            </w:tcMar>
+            <w:shd w:fill="F4F8FC"/>
+          </w:tcPr>
+          <w:p>
+            <w:pPr>
+              <w:jc w:val="center"/>
+            </w:pPr>
+            <w:r>
+              <w:rPr>
+                <w:rFonts w:ascii="SimSun" w:hAnsi="SimSun" w:eastAsia="SimSun"/>
+                <w:b w:val="0"/>
+                <w:color w:val="183153"/>
+                <w:sz w:val="17"/>
+              </w:rPr>
+              <w:t>医学监护场景推荐矩阵</w:t>
+            </w:r>
+          </w:p>
+        </w:tc>
+      </w:tr>
+      <w:tr>
+        <w:tc>
+          <w:tcPr>
+            <w:tcW w:type="dxa" w:w="3168"/>
+            <w:vAlign w:val="center"/>
+            <w:tcMar>
+              <w:top w:w="90" w:type="dxa"/>
+              <w:start w:w="110" w:type="dxa"/>
+              <w:bottom w:w="90" w:type="dxa"/>
+              <w:end w:w="110" w:type="dxa"/>
+            </w:tcMar>
+          </w:tcPr>
+          <w:p>
+            <w:pPr>
+              <w:jc w:val="left"/>
+            </w:pPr>
+            <w:r>
+              <w:rPr>
+                <w:rFonts w:ascii="SimSun" w:hAnsi="SimSun" w:eastAsia="SimSun"/>
+                <w:b w:val="0"/>
+                <w:color w:val="183153"/>
+                <w:sz w:val="17"/>
+              </w:rPr>
               <w:t>figures/figure_*.png</w:t>
             </w:r>
           </w:p>
@@ -8416,7 +11299,7 @@
                 <w:color w:val="183153"/>
                 <w:sz w:val="17"/>
               </w:rPr>
-              <w:t>系统图、流程图、波形图、热力图、鲁棒性曲线和帕累托图</w:t>
+              <w:t>系统图、流程图、波形图、热力图、鲁棒性曲线、帕累托图和监护指标图</w:t>
             </w:r>
           </w:p>
         </w:tc>
@@ -8674,6 +11557,36 @@
           <w:sz w:val="21"/>
         </w:rPr>
         <w:t>python src/analyze_results.py</w:t>
+      </w:r>
+    </w:p>
+    <w:p>
+      <w:pPr>
+        <w:pStyle w:val="ListBullet"/>
+        <w:spacing w:after="80" w:line="288" w:lineRule="auto"/>
+      </w:pPr>
+      <w:r>
+        <w:rPr>
+          <w:rFonts w:ascii="SimSun" w:hAnsi="SimSun" w:eastAsia="SimSun"/>
+          <w:b w:val="0"/>
+          <w:color w:val="183153"/>
+          <w:sz w:val="21"/>
+        </w:rPr>
+        <w:t>python src/monitoring_analysis.py</w:t>
+      </w:r>
+    </w:p>
+    <w:p>
+      <w:pPr>
+        <w:pStyle w:val="ListBullet"/>
+        <w:spacing w:after="80" w:line="288" w:lineRule="auto"/>
+      </w:pPr>
+      <w:r>
+        <w:rPr>
+          <w:rFonts w:ascii="SimSun" w:hAnsi="SimSun" w:eastAsia="SimSun"/>
+          <w:b w:val="0"/>
+          <w:color w:val="183153"/>
+          <w:sz w:val="21"/>
+        </w:rPr>
+        <w:t>python src/build_web_data.py</w:t>
       </w:r>
     </w:p>
     <w:p>

</xml_diff>